<commit_message>
feat(paper): update ensembling with same-split XGBoost v2 and add feature appendix
    - Tune notebooks/08_XGBoost_v2.ipynb to use the local development split (train_dev.parquet)
    - Include XGBoost v2 in Blend v2 candidate ensembling configuration
    - Update ensembling MSE (180.01) and weights in main.tex and main_journal.tex
    - Recalculate paired significance test statistics (t=5.33, p=1.0e-7) in both papers
    - Generate a complete 151-column feature inventory table in the appendix
    - Regenerate all paper figures and rebuild final docx and pdf papers
</commit_message>
<xml_diff>
--- a/paper/Final_Project_Paper_Bakir_Baskal_IEEE.docx
+++ b/paper/Final_Project_Paper_Bakir_Baskal_IEEE.docx
@@ -463,7 +463,7 @@
           <w:i/>
           <w:sz w:val="18"/>
         </w:rPr>
-        <w:t xml:space="preserve">further to 180.5. We formally define the target-encoding, search, MLP, and</w:t>
+        <w:t xml:space="preserve">further to 180.0. We formally define the target-encoding, search, MLP, and</w:t>
       </w:r>
       <w:r>
         <w:rPr>
@@ -508,7 +508,7 @@
           <m:t>=</m:t>
         </m:r>
         <m:r>
-          <m:t>4.55</m:t>
+          <m:t>5.33</m:t>
         </m:r>
       </m:oMath>
       <w:r>
@@ -538,7 +538,7 @@
           <m:t>=</m:t>
         </m:r>
         <m:r>
-          <m:t>5.3</m:t>
+          <m:t>1.0</m:t>
         </m:r>
         <m:r>
           <m:rPr>
@@ -560,7 +560,7 @@
               <m:t>−</m:t>
             </m:r>
             <m:r>
-              <m:t>6</m:t>
+              <m:t>7</m:t>
             </m:r>
           </m:sup>
         </m:sSup>
@@ -4058,7 +4058,7 @@
         </w:rPr>
         <w:drawing>
           <wp:inline>
-            <wp:extent cx="3017520" cy="862148"/>
+            <wp:extent cx="3017520" cy="1943407"/>
             <wp:effectExtent b="0" l="0" r="0" t="0"/>
             <wp:docPr descr="" title="" id="24" name="Picture"/>
             <a:graphic>
@@ -4079,7 +4079,7 @@
                   <pic:spPr bwMode="auto">
                     <a:xfrm>
                       <a:off x="0" y="0"/>
-                      <a:ext cx="3017520" cy="862148"/>
+                      <a:ext cx="3017520" cy="1943407"/>
                     </a:xfrm>
                     <a:prstGeom prst="rect">
                       <a:avLst/>
@@ -5761,7 +5761,7 @@
         </w:rPr>
         <w:drawing>
           <wp:inline>
-            <wp:extent cx="3017520" cy="2346959"/>
+            <wp:extent cx="3017520" cy="2197209"/>
             <wp:effectExtent b="0" l="0" r="0" t="0"/>
             <wp:docPr descr="" title="" id="32" name="Picture"/>
             <a:graphic>
@@ -5782,7 +5782,7 @@
                   <pic:spPr bwMode="auto">
                     <a:xfrm>
                       <a:off x="0" y="0"/>
-                      <a:ext cx="3017520" cy="2346959"/>
+                      <a:ext cx="3017520" cy="2197209"/>
                     </a:xfrm>
                     <a:prstGeom prst="rect">
                       <a:avLst/>
@@ -16064,7 +16064,7 @@
         <w:t xml:space="preserve"> </w:t>
       </w:r>
       <w:r>
-        <w:t xml:space="preserve">out-of-fold error down to 180.5—about a 2% relative improvement over the best</w:t>
+        <w:t xml:space="preserve">out-of-fold error down to 180.0—about a 2% relative improvement over the best</w:t>
       </w:r>
       <w:r>
         <w:t xml:space="preserve"> </w:t>
@@ -16504,7 +16504,7 @@
                 <w:b/>
                 <w:bCs/>
               </w:rPr>
-              <w:t xml:space="preserve">180.5</w:t>
+              <w:t xml:space="preserve">180.0</w:t>
             </w:r>
           </w:p>
         </w:tc>
@@ -16547,7 +16547,7 @@
         </w:rPr>
         <w:drawing>
           <wp:inline>
-            <wp:extent cx="3017520" cy="1508760"/>
+            <wp:extent cx="3017520" cy="1769942"/>
             <wp:effectExtent b="0" l="0" r="0" t="0"/>
             <wp:docPr descr="" title="" id="55" name="Picture"/>
             <a:graphic>
@@ -16568,7 +16568,7 @@
                   <pic:spPr bwMode="auto">
                     <a:xfrm>
                       <a:off x="0" y="0"/>
-                      <a:ext cx="3017520" cy="1508760"/>
+                      <a:ext cx="3017520" cy="1769942"/>
                     </a:xfrm>
                     <a:prstGeom prst="rect">
                       <a:avLst/>
@@ -16904,7 +16904,7 @@
         </w:rPr>
         <w:drawing>
           <wp:inline>
-            <wp:extent cx="3017520" cy="2682239"/>
+            <wp:extent cx="3017520" cy="2197209"/>
             <wp:effectExtent b="0" l="0" r="0" t="0"/>
             <wp:docPr descr="" title="" id="59" name="Picture"/>
             <a:graphic>
@@ -16925,7 +16925,7 @@
                   <pic:spPr bwMode="auto">
                     <a:xfrm>
                       <a:off x="0" y="0"/>
-                      <a:ext cx="3017520" cy="2682239"/>
+                      <a:ext cx="3017520" cy="2197209"/>
                     </a:xfrm>
                     <a:prstGeom prst="rect">
                       <a:avLst/>
@@ -17105,7 +17105,7 @@
         <w:t xml:space="preserve"> </w:t>
       </w:r>
       <w:r>
-        <w:t xml:space="preserve">SLSQP choose the weights, the error dropped to 180.5—the optimizer effectively</w:t>
+        <w:t xml:space="preserve">SLSQP choose the weights, the error dropped to 180.0—the optimizer effectively</w:t>
       </w:r>
       <w:r>
         <w:t xml:space="preserve"> </w:t>
@@ -17166,7 +17166,7 @@
         </w:rPr>
         <w:drawing>
           <wp:inline>
-            <wp:extent cx="3017520" cy="1508760"/>
+            <wp:extent cx="3017520" cy="1708955"/>
             <wp:effectExtent b="0" l="0" r="0" t="0"/>
             <wp:docPr descr="" title="" id="64" name="Picture"/>
             <a:graphic>
@@ -17187,7 +17187,7 @@
                   <pic:spPr bwMode="auto">
                     <a:xfrm>
                       <a:off x="0" y="0"/>
-                      <a:ext cx="3017520" cy="1508760"/>
+                      <a:ext cx="3017520" cy="1708955"/>
                     </a:xfrm>
                     <a:prstGeom prst="rect">
                       <a:avLst/>
@@ -17362,7 +17362,7 @@
               <w:jc w:val="center"/>
             </w:pPr>
             <w:r>
-              <w:t xml:space="preserve">0.1001</w:t>
+              <w:t xml:space="preserve">0.0628</w:t>
             </w:r>
           </w:p>
         </w:tc>
@@ -17388,7 +17388,7 @@
               <w:jc w:val="center"/>
             </w:pPr>
             <w:r>
-              <w:t xml:space="preserve">0.0323</w:t>
+              <w:t xml:space="preserve">0.0000</w:t>
             </w:r>
           </w:p>
         </w:tc>
@@ -17440,7 +17440,7 @@
               <w:jc w:val="center"/>
             </w:pPr>
             <w:r>
-              <w:t xml:space="preserve">0.7250</w:t>
+              <w:t xml:space="preserve">0.3406</w:t>
             </w:r>
           </w:p>
         </w:tc>
@@ -17466,7 +17466,85 @@
               <w:jc w:val="center"/>
             </w:pPr>
             <w:r>
-              <w:t xml:space="preserve">0.1426</w:t>
+              <w:t xml:space="preserve">0.1064</w:t>
+            </w:r>
+          </w:p>
+        </w:tc>
+      </w:tr>
+      <w:tr>
+        <w:tc>
+          <w:tcPr/>
+          <w:p>
+            <w:pPr>
+              <w:pStyle w:val="Compact"/>
+              <w:jc w:val="left"/>
+            </w:pPr>
+            <w:r>
+              <w:t xml:space="preserve">XGBoost v3</w:t>
+            </w:r>
+          </w:p>
+        </w:tc>
+        <w:tc>
+          <w:tcPr/>
+          <w:p>
+            <w:pPr>
+              <w:pStyle w:val="Compact"/>
+              <w:jc w:val="center"/>
+            </w:pPr>
+            <w:r>
+              <w:t xml:space="preserve">0.2557</w:t>
+            </w:r>
+          </w:p>
+        </w:tc>
+      </w:tr>
+      <w:tr>
+        <w:tc>
+          <w:tcPr/>
+          <w:p>
+            <w:pPr>
+              <w:pStyle w:val="Compact"/>
+              <w:jc w:val="left"/>
+            </w:pPr>
+            <w:r>
+              <w:t xml:space="preserve">LightGBM</w:t>
+            </w:r>
+          </w:p>
+        </w:tc>
+        <w:tc>
+          <w:tcPr/>
+          <w:p>
+            <w:pPr>
+              <w:pStyle w:val="Compact"/>
+              <w:jc w:val="center"/>
+            </w:pPr>
+            <w:r>
+              <w:t xml:space="preserve">0.2014</w:t>
+            </w:r>
+          </w:p>
+        </w:tc>
+      </w:tr>
+      <w:tr>
+        <w:tc>
+          <w:tcPr/>
+          <w:p>
+            <w:pPr>
+              <w:pStyle w:val="Compact"/>
+              <w:jc w:val="left"/>
+            </w:pPr>
+            <w:r>
+              <w:t xml:space="preserve">CatBoost</w:t>
+            </w:r>
+          </w:p>
+        </w:tc>
+        <w:tc>
+          <w:tcPr/>
+          <w:p>
+            <w:pPr>
+              <w:pStyle w:val="Compact"/>
+              <w:jc w:val="center"/>
+            </w:pPr>
+            <w:r>
+              <w:t xml:space="preserve">0.0330</w:t>
             </w:r>
           </w:p>
         </w:tc>
@@ -17711,7 +17789,7 @@
         <w:t xml:space="preserve"> </w:t>
       </w:r>
       <w:r>
-        <w:t xml:space="preserve">The blend improves not only the optimized MSE (180.50 vs. 182.19) but also the</w:t>
+        <w:t xml:space="preserve">The blend improves not only the optimized MSE (180.01 vs. 182.19) but also the</w:t>
       </w:r>
       <w:r>
         <w:t xml:space="preserve"> </w:t>
@@ -18054,7 +18132,7 @@
               <w:jc w:val="center"/>
             </w:pPr>
             <w:r>
-              <w:t xml:space="preserve">217.62</w:t>
+              <w:t xml:space="preserve">220.26</w:t>
             </w:r>
           </w:p>
         </w:tc>
@@ -18129,6 +18207,156 @@
             </w:pPr>
             <w:r>
               <w:t xml:space="preserve">0.764</w:t>
+            </w:r>
+          </w:p>
+        </w:tc>
+      </w:tr>
+      <w:tr>
+        <w:tc>
+          <w:tcPr/>
+          <w:p>
+            <w:pPr>
+              <w:pStyle w:val="Compact"/>
+              <w:jc w:val="left"/>
+            </w:pPr>
+            <w:r>
+              <w:t xml:space="preserve">XGBoost v3</w:t>
+            </w:r>
+          </w:p>
+        </w:tc>
+        <w:tc>
+          <w:tcPr/>
+          <w:p>
+            <w:pPr>
+              <w:pStyle w:val="Compact"/>
+              <w:jc w:val="center"/>
+            </w:pPr>
+            <w:r>
+              <w:t xml:space="preserve">182.87</w:t>
+            </w:r>
+          </w:p>
+        </w:tc>
+        <w:tc>
+          <w:tcPr/>
+          <w:p>
+            <w:pPr>
+              <w:pStyle w:val="Compact"/>
+              <w:jc w:val="center"/>
+            </w:pPr>
+            <w:r>
+              <w:t xml:space="preserve">8.18</w:t>
+            </w:r>
+          </w:p>
+        </w:tc>
+        <w:tc>
+          <w:tcPr/>
+          <w:p>
+            <w:pPr>
+              <w:pStyle w:val="Compact"/>
+              <w:jc w:val="center"/>
+            </w:pPr>
+            <w:r>
+              <w:t xml:space="preserve">0.763</w:t>
+            </w:r>
+          </w:p>
+        </w:tc>
+      </w:tr>
+      <w:tr>
+        <w:tc>
+          <w:tcPr/>
+          <w:p>
+            <w:pPr>
+              <w:pStyle w:val="Compact"/>
+              <w:jc w:val="left"/>
+            </w:pPr>
+            <w:r>
+              <w:t xml:space="preserve">LightGBM</w:t>
+            </w:r>
+          </w:p>
+        </w:tc>
+        <w:tc>
+          <w:tcPr/>
+          <w:p>
+            <w:pPr>
+              <w:pStyle w:val="Compact"/>
+              <w:jc w:val="center"/>
+            </w:pPr>
+            <w:r>
+              <w:t xml:space="preserve">184.39</w:t>
+            </w:r>
+          </w:p>
+        </w:tc>
+        <w:tc>
+          <w:tcPr/>
+          <w:p>
+            <w:pPr>
+              <w:pStyle w:val="Compact"/>
+              <w:jc w:val="center"/>
+            </w:pPr>
+            <w:r>
+              <w:t xml:space="preserve">8.24</w:t>
+            </w:r>
+          </w:p>
+        </w:tc>
+        <w:tc>
+          <w:tcPr/>
+          <w:p>
+            <w:pPr>
+              <w:pStyle w:val="Compact"/>
+              <w:jc w:val="center"/>
+            </w:pPr>
+            <w:r>
+              <w:t xml:space="preserve">0.762</w:t>
+            </w:r>
+          </w:p>
+        </w:tc>
+      </w:tr>
+      <w:tr>
+        <w:tc>
+          <w:tcPr/>
+          <w:p>
+            <w:pPr>
+              <w:pStyle w:val="Compact"/>
+              <w:jc w:val="left"/>
+            </w:pPr>
+            <w:r>
+              <w:t xml:space="preserve">CatBoost</w:t>
+            </w:r>
+          </w:p>
+        </w:tc>
+        <w:tc>
+          <w:tcPr/>
+          <w:p>
+            <w:pPr>
+              <w:pStyle w:val="Compact"/>
+              <w:jc w:val="center"/>
+            </w:pPr>
+            <w:r>
+              <w:t xml:space="preserve">184.55</w:t>
+            </w:r>
+          </w:p>
+        </w:tc>
+        <w:tc>
+          <w:tcPr/>
+          <w:p>
+            <w:pPr>
+              <w:pStyle w:val="Compact"/>
+              <w:jc w:val="center"/>
+            </w:pPr>
+            <w:r>
+              <w:t xml:space="preserve">8.27</w:t>
+            </w:r>
+          </w:p>
+        </w:tc>
+        <w:tc>
+          <w:tcPr/>
+          <w:p>
+            <w:pPr>
+              <w:pStyle w:val="Compact"/>
+              <w:jc w:val="center"/>
+            </w:pPr>
+            <w:r>
+              <w:t xml:space="preserve">0.762</w:t>
             </w:r>
           </w:p>
         </w:tc>
@@ -18162,7 +18390,7 @@
                 <w:b/>
                 <w:bCs/>
               </w:rPr>
-              <w:t xml:space="preserve">180.50</w:t>
+              <w:t xml:space="preserve">180.01</w:t>
             </w:r>
           </w:p>
         </w:tc>
@@ -18178,7 +18406,7 @@
                 <w:b/>
                 <w:bCs/>
               </w:rPr>
-              <w:t xml:space="preserve">8.10</w:t>
+              <w:t xml:space="preserve">8.11</w:t>
             </w:r>
           </w:p>
         </w:tc>
@@ -18194,7 +18422,7 @@
                 <w:b/>
                 <w:bCs/>
               </w:rPr>
-              <w:t xml:space="preserve">0.766</w:t>
+              <w:t xml:space="preserve">0.767</w:t>
             </w:r>
           </w:p>
         </w:tc>
@@ -18708,7 +18936,7 @@
         <w:jc w:val="both"/>
       </w:pPr>
       <w:r>
-        <w:t xml:space="preserve">A drop from 182.2 to 180.5 MSE is small, so we tested whether it is real or just</w:t>
+        <w:t xml:space="preserve">A drop from 182.2 to 180.0 MSE is small, so we tested whether it is real or just</w:t>
       </w:r>
       <w:r>
         <w:t xml:space="preserve"> </w:t>
@@ -19123,7 +19351,7 @@
           <m:t>−</m:t>
         </m:r>
         <m:r>
-          <m:t>180.50</m:t>
+          <m:t>180.01</m:t>
         </m:r>
         <m:r>
           <m:rPr>
@@ -19132,7 +19360,7 @@
           <m:t>=</m:t>
         </m:r>
         <m:r>
-          <m:t>1.69</m:t>
+          <m:t>2.18</m:t>
         </m:r>
       </m:oMath>
       <w:r>
@@ -19238,7 +19466,7 @@
           <m:t>=</m:t>
         </m:r>
         <m:r>
-          <m:t>4.55</m:t>
+          <m:t>5.33</m:t>
         </m:r>
       </m:oMath>
       <w:r>
@@ -19261,7 +19489,7 @@
           <m:t>=</m:t>
         </m:r>
         <m:r>
-          <m:t>5.3</m:t>
+          <m:t>1.0</m:t>
         </m:r>
         <m:r>
           <m:rPr>
@@ -19283,7 +19511,7 @@
               <m:t>−</m:t>
             </m:r>
             <m:r>
-              <m:t>6</m:t>
+              <m:t>7</m:t>
             </m:r>
           </m:sup>
         </m:sSup>
@@ -19308,7 +19536,7 @@
           <m:t>[</m:t>
         </m:r>
         <m:r>
-          <m:t>0.96</m:t>
+          <m:t>1.38</m:t>
         </m:r>
         <m:r>
           <m:rPr>
@@ -19320,7 +19548,7 @@
           <m:t> </m:t>
         </m:r>
         <m:r>
-          <m:t>2.42</m:t>
+          <m:t>2.98</m:t>
         </m:r>
         <m:r>
           <m:rPr>
@@ -19362,7 +19590,7 @@
               <m:t>−</m:t>
             </m:r>
             <m:r>
-              <m:t>50</m:t>
+              <m:t>21</m:t>
             </m:r>
           </m:sup>
         </m:sSup>
@@ -19425,7 +19653,7 @@
           <m:t>≈</m:t>
         </m:r>
         <m:r>
-          <m:t>0.03</m:t>
+          <m:t>0.04</m:t>
         </m:r>
       </m:oMath>
       <w:r>
@@ -19796,7 +20024,7 @@
         </w:rPr>
         <w:drawing>
           <wp:inline>
-            <wp:extent cx="3017520" cy="2194559"/>
+            <wp:extent cx="3017520" cy="2250151"/>
             <wp:effectExtent b="0" l="0" r="0" t="0"/>
             <wp:docPr descr="" title="" id="74" name="Picture"/>
             <a:graphic>
@@ -19817,7 +20045,7 @@
                   <pic:spPr bwMode="auto">
                     <a:xfrm>
                       <a:off x="0" y="0"/>
-                      <a:ext cx="3017520" cy="2194559"/>
+                      <a:ext cx="3017520" cy="2250151"/>
                     </a:xfrm>
                     <a:prstGeom prst="rect">
                       <a:avLst/>
@@ -20330,7 +20558,7 @@
         </w:rPr>
         <w:drawing>
           <wp:inline>
-            <wp:extent cx="3017520" cy="1676399"/>
+            <wp:extent cx="3017520" cy="1824464"/>
             <wp:effectExtent b="0" l="0" r="0" t="0"/>
             <wp:docPr descr="" title="" id="78" name="Picture"/>
             <a:graphic>
@@ -20351,7 +20579,7 @@
                   <pic:spPr bwMode="auto">
                     <a:xfrm>
                       <a:off x="0" y="0"/>
-                      <a:ext cx="3017520" cy="1676399"/>
+                      <a:ext cx="3017520" cy="1824464"/>
                     </a:xfrm>
                     <a:prstGeom prst="rect">
                       <a:avLst/>
@@ -20529,13 +20757,13 @@
         <w:t xml:space="preserve"> </w:t>
       </w:r>
       <w:r>
-        <w:t xml:space="preserve">blend scores 180.500 MSE; after clipping and integer rounding the score rises only</w:t>
-      </w:r>
-      <w:r>
-        <w:t xml:space="preserve"> </w:t>
-      </w:r>
-      <w:r>
-        <w:t xml:space="preserve">to 180.574, an increase of</w:t>
+        <w:t xml:space="preserve">blend scores 180.010 MSE; after clipping and integer rounding the score rises only</w:t>
+      </w:r>
+      <w:r>
+        <w:t xml:space="preserve"> </w:t>
+      </w:r>
+      <w:r>
+        <w:t xml:space="preserve">to 180.074, an increase of</w:t>
       </w:r>
       <w:r>
         <w:t xml:space="preserve"> </w:t>
@@ -20645,7 +20873,7 @@
         <w:t xml:space="preserve"> </w:t>
       </w:r>
       <w:r>
-        <w:t xml:space="preserve">between our internal OOF estimate (180.5) and the leaderboard score (185.5)</w:t>
+        <w:t xml:space="preserve">between our internal OOF estimate (180.0) and the leaderboard score (185.5)</w:t>
       </w:r>
       <w:r>
         <w:t xml:space="preserve"> </w:t>
@@ -20736,7 +20964,7 @@
         <w:t xml:space="preserve"> </w:t>
       </w:r>
       <w:r>
-        <w:t xml:space="preserve">estimate (180.5), and the small gap is expected: the public score is computed on</w:t>
+        <w:t xml:space="preserve">estimate (180.0), and the small gap is expected: the public score is computed on</w:t>
       </w:r>
       <w:r>
         <w:t xml:space="preserve"> </w:t>
@@ -20930,7 +21158,7 @@
         <w:t xml:space="preserve"> </w:t>
       </w:r>
       <w:r>
-        <w:t xml:space="preserve">between the OOF MSE (180.5) and the leaderboard MSE (185.5) is empirical support</w:t>
+        <w:t xml:space="preserve">between the OOF MSE (180.0) and the leaderboard MSE (185.5) is empirical support</w:t>
       </w:r>
       <w:r>
         <w:t xml:space="preserve"> </w:t>
@@ -22815,7 +23043,7 @@
       </w:r>
     </w:p>
     <w:bookmarkEnd w:id="94"/>
-    <w:bookmarkStart w:id="135" w:name="kaggle-submission-evidence"/>
+    <w:bookmarkStart w:id="96" w:name="kaggle-submission-evidence"/>
     <w:p>
       <w:pPr>
         <w:pStyle w:val="Heading1"/>
@@ -22955,8 +23183,3885 @@
         <w:t xml:space="preserve">files to Kaggle manually.</w:t>
       </w:r>
     </w:p>
-    <w:bookmarkStart w:id="134" w:name="refs"/>
-    <w:bookmarkStart w:id="97" w:name="ref-adamiak2018"/>
+    <w:bookmarkEnd w:id="96"/>
+    <w:bookmarkStart w:id="136" w:name="app:allfeatures_table"/>
+    <w:p>
+      <w:pPr>
+        <w:pStyle w:val="Heading1"/>
+        <w:jc w:val="center"/>
+      </w:pPr>
+      <w:r>
+        <w:rPr>
+          <w:rFonts w:ascii="Times New Roman" w:hAnsi="Times New Roman"/>
+          <w:b w:val="0"/>
+          <w:i w:val="0"/>
+          <w:smallCaps/>
+          <w:sz w:val="20"/>
+        </w:rPr>
+        <w:t>X. Complete Feature Inventory</w:t>
+      </w:r>
+    </w:p>
+    <w:p>
+      <w:pPr>
+        <w:pStyle w:val="FirstParagraph"/>
+        <w:jc w:val="both"/>
+      </w:pPr>
+      <w:r>
+        <w:t xml:space="preserve">Here is the complete inventory of all 149 engineered features, along with the identifier and target variables, and their corresponding data types.</w:t>
+      </w:r>
+    </w:p>
+    <w:tbl>
+      <w:tblPr>
+        <w:tblStyle w:val="Table"/>
+        <w:tblW w:type="auto" w:w="0"/>
+        <w:tblLook w:firstRow="1" w:lastRow="0" w:firstColumn="0" w:lastColumn="0" w:noHBand="0" w:noVBand="0" w:val="0020"/>
+      </w:tblPr>
+      <w:tblGrid>
+        <w:gridCol w:w="1320"/>
+        <w:gridCol w:w="1320"/>
+        <w:gridCol w:w="1320"/>
+        <w:gridCol w:w="1320"/>
+        <w:gridCol w:w="1320"/>
+        <w:gridCol w:w="1320"/>
+      </w:tblGrid>
+      <w:tr>
+        <w:trPr>
+          <w:tblHeader w:val="on"/>
+        </w:trPr>
+        <w:tc>
+          <w:tcPr/>
+          <w:p>
+            <w:pPr>
+              <w:pStyle w:val="Compact"/>
+              <w:jc w:val="left"/>
+            </w:pPr>
+            <w:r>
+              <w:t xml:space="preserve">Feature Name</w:t>
+            </w:r>
+          </w:p>
+        </w:tc>
+        <w:tc>
+          <w:tcPr/>
+          <w:p>
+            <w:pPr>
+              <w:pStyle w:val="Compact"/>
+              <w:jc w:val="left"/>
+            </w:pPr>
+            <w:r>
+              <w:t xml:space="preserve">Type</w:t>
+            </w:r>
+          </w:p>
+        </w:tc>
+        <w:tc>
+          <w:tcPr/>
+          <w:p>
+            <w:pPr>
+              <w:pStyle w:val="Compact"/>
+              <w:jc w:val="left"/>
+            </w:pPr>
+            <w:r>
+              <w:t xml:space="preserve">Feature Name</w:t>
+            </w:r>
+          </w:p>
+        </w:tc>
+        <w:tc>
+          <w:tcPr/>
+          <w:p>
+            <w:pPr>
+              <w:pStyle w:val="Compact"/>
+              <w:jc w:val="left"/>
+            </w:pPr>
+            <w:r>
+              <w:t xml:space="preserve">Type</w:t>
+            </w:r>
+          </w:p>
+        </w:tc>
+        <w:tc>
+          <w:tcPr/>
+          <w:p>
+            <w:pPr>
+              <w:pStyle w:val="Compact"/>
+              <w:jc w:val="left"/>
+            </w:pPr>
+            <w:r>
+              <w:t xml:space="preserve">Feature Name</w:t>
+            </w:r>
+          </w:p>
+        </w:tc>
+        <w:tc>
+          <w:tcPr/>
+          <w:p>
+            <w:pPr>
+              <w:pStyle w:val="Compact"/>
+              <w:jc w:val="left"/>
+            </w:pPr>
+            <w:r>
+              <w:t xml:space="preserve">Type</w:t>
+            </w:r>
+          </w:p>
+        </w:tc>
+      </w:tr>
+      <w:tr>
+        <w:tc>
+          <w:tcPr/>
+          <w:p>
+            <w:pPr>
+              <w:pStyle w:val="Compact"/>
+              <w:jc w:val="left"/>
+            </w:pPr>
+            <w:r>
+              <w:t xml:space="preserve">PropertyID</w:t>
+            </w:r>
+          </w:p>
+        </w:tc>
+        <w:tc>
+          <w:tcPr/>
+          <w:p>
+            <w:pPr>
+              <w:pStyle w:val="Compact"/>
+              <w:jc w:val="left"/>
+            </w:pPr>
+            <w:r>
+              <w:t xml:space="preserve">integer (ID)</w:t>
+            </w:r>
+          </w:p>
+        </w:tc>
+        <w:tc>
+          <w:tcPr/>
+          <w:p>
+            <w:pPr>
+              <w:pStyle w:val="Compact"/>
+              <w:jc w:val="left"/>
+            </w:pPr>
+            <w:r>
+              <w:t xml:space="preserve">q1_days_A</w:t>
+            </w:r>
+          </w:p>
+        </w:tc>
+        <w:tc>
+          <w:tcPr/>
+          <w:p>
+            <w:pPr>
+              <w:pStyle w:val="Compact"/>
+              <w:jc w:val="left"/>
+            </w:pPr>
+            <w:r>
+              <w:t xml:space="preserve">binary</w:t>
+            </w:r>
+          </w:p>
+        </w:tc>
+        <w:tc>
+          <w:tcPr/>
+          <w:p>
+            <w:pPr>
+              <w:pStyle w:val="Compact"/>
+              <w:jc w:val="left"/>
+            </w:pPr>
+            <w:r>
+              <w:t xml:space="preserve">h1_available_rate</w:t>
+            </w:r>
+          </w:p>
+        </w:tc>
+        <w:tc>
+          <w:tcPr/>
+          <w:p>
+            <w:pPr>
+              <w:pStyle w:val="Compact"/>
+              <w:jc w:val="left"/>
+            </w:pPr>
+            <w:r>
+              <w:t xml:space="preserve">float</w:t>
+            </w:r>
+          </w:p>
+        </w:tc>
+      </w:tr>
+      <w:tr>
+        <w:tc>
+          <w:tcPr/>
+          <w:p>
+            <w:pPr>
+              <w:pStyle w:val="Compact"/>
+              <w:jc w:val="left"/>
+            </w:pPr>
+            <w:r>
+              <w:t xml:space="preserve">NumReserveDays2016Q3</w:t>
+            </w:r>
+          </w:p>
+        </w:tc>
+        <w:tc>
+          <w:tcPr/>
+          <w:p>
+            <w:pPr>
+              <w:pStyle w:val="Compact"/>
+              <w:jc w:val="left"/>
+            </w:pPr>
+            <w:r>
+              <w:t xml:space="preserve">integer (target)</w:t>
+            </w:r>
+          </w:p>
+        </w:tc>
+        <w:tc>
+          <w:tcPr/>
+          <w:p>
+            <w:pPr>
+              <w:pStyle w:val="Compact"/>
+              <w:jc w:val="left"/>
+            </w:pPr>
+            <w:r>
+              <w:t xml:space="preserve">q1_days_B</w:t>
+            </w:r>
+          </w:p>
+        </w:tc>
+        <w:tc>
+          <w:tcPr/>
+          <w:p>
+            <w:pPr>
+              <w:pStyle w:val="Compact"/>
+              <w:jc w:val="left"/>
+            </w:pPr>
+            <w:r>
+              <w:t xml:space="preserve">binary</w:t>
+            </w:r>
+          </w:p>
+        </w:tc>
+        <w:tc>
+          <w:tcPr/>
+          <w:p>
+            <w:pPr>
+              <w:pStyle w:val="Compact"/>
+              <w:jc w:val="left"/>
+            </w:pPr>
+            <w:r>
+              <w:t xml:space="preserve">h1_reserved_rate</w:t>
+            </w:r>
+          </w:p>
+        </w:tc>
+        <w:tc>
+          <w:tcPr/>
+          <w:p>
+            <w:pPr>
+              <w:pStyle w:val="Compact"/>
+              <w:jc w:val="left"/>
+            </w:pPr>
+            <w:r>
+              <w:t xml:space="preserve">float</w:t>
+            </w:r>
+          </w:p>
+        </w:tc>
+      </w:tr>
+      <w:tr>
+        <w:tc>
+          <w:tcPr/>
+          <w:p>
+            <w:pPr>
+              <w:pStyle w:val="Compact"/>
+              <w:jc w:val="left"/>
+            </w:pPr>
+            <w:r>
+              <w:t xml:space="preserve">PropertyType</w:t>
+            </w:r>
+          </w:p>
+        </w:tc>
+        <w:tc>
+          <w:tcPr/>
+          <w:p>
+            <w:pPr>
+              <w:pStyle w:val="Compact"/>
+              <w:jc w:val="left"/>
+            </w:pPr>
+            <w:r>
+              <w:t xml:space="preserve">str</w:t>
+            </w:r>
+          </w:p>
+        </w:tc>
+        <w:tc>
+          <w:tcPr/>
+          <w:p>
+            <w:pPr>
+              <w:pStyle w:val="Compact"/>
+              <w:jc w:val="left"/>
+            </w:pPr>
+            <w:r>
+              <w:t xml:space="preserve">q1_days_R</w:t>
+            </w:r>
+          </w:p>
+        </w:tc>
+        <w:tc>
+          <w:tcPr/>
+          <w:p>
+            <w:pPr>
+              <w:pStyle w:val="Compact"/>
+              <w:jc w:val="left"/>
+            </w:pPr>
+            <w:r>
+              <w:t xml:space="preserve">binary</w:t>
+            </w:r>
+          </w:p>
+        </w:tc>
+        <w:tc>
+          <w:tcPr/>
+          <w:p>
+            <w:pPr>
+              <w:pStyle w:val="Compact"/>
+              <w:jc w:val="left"/>
+            </w:pPr>
+            <w:r>
+              <w:t xml:space="preserve">h1_price_range</w:t>
+            </w:r>
+          </w:p>
+        </w:tc>
+        <w:tc>
+          <w:tcPr/>
+          <w:p>
+            <w:pPr>
+              <w:pStyle w:val="Compact"/>
+              <w:jc w:val="left"/>
+            </w:pPr>
+            <w:r>
+              <w:t xml:space="preserve">float</w:t>
+            </w:r>
+          </w:p>
+        </w:tc>
+      </w:tr>
+      <w:tr>
+        <w:tc>
+          <w:tcPr/>
+          <w:p>
+            <w:pPr>
+              <w:pStyle w:val="Compact"/>
+              <w:jc w:val="left"/>
+            </w:pPr>
+            <w:r>
+              <w:t xml:space="preserve">ListingType</w:t>
+            </w:r>
+          </w:p>
+        </w:tc>
+        <w:tc>
+          <w:tcPr/>
+          <w:p>
+            <w:pPr>
+              <w:pStyle w:val="Compact"/>
+              <w:jc w:val="left"/>
+            </w:pPr>
+            <w:r>
+              <w:t xml:space="preserve">str</w:t>
+            </w:r>
+          </w:p>
+        </w:tc>
+        <w:tc>
+          <w:tcPr/>
+          <w:p>
+            <w:pPr>
+              <w:pStyle w:val="Compact"/>
+              <w:jc w:val="left"/>
+            </w:pPr>
+            <w:r>
+              <w:t xml:space="preserve">q1_unique_reservations</w:t>
+            </w:r>
+          </w:p>
+        </w:tc>
+        <w:tc>
+          <w:tcPr/>
+          <w:p>
+            <w:pPr>
+              <w:pStyle w:val="Compact"/>
+              <w:jc w:val="left"/>
+            </w:pPr>
+            <w:r>
+              <w:t xml:space="preserve">integer</w:t>
+            </w:r>
+          </w:p>
+        </w:tc>
+        <w:tc>
+          <w:tcPr/>
+          <w:p>
+            <w:pPr>
+              <w:pStyle w:val="Compact"/>
+              <w:jc w:val="left"/>
+            </w:pPr>
+            <w:r>
+              <w:t xml:space="preserve">h1_price_cv</w:t>
+            </w:r>
+          </w:p>
+        </w:tc>
+        <w:tc>
+          <w:tcPr/>
+          <w:p>
+            <w:pPr>
+              <w:pStyle w:val="Compact"/>
+              <w:jc w:val="left"/>
+            </w:pPr>
+            <w:r>
+              <w:t xml:space="preserve">float</w:t>
+            </w:r>
+          </w:p>
+        </w:tc>
+      </w:tr>
+      <w:tr>
+        <w:tc>
+          <w:tcPr/>
+          <w:p>
+            <w:pPr>
+              <w:pStyle w:val="Compact"/>
+              <w:jc w:val="left"/>
+            </w:pPr>
+            <w:r>
+              <w:t xml:space="preserve">Zipcode</w:t>
+            </w:r>
+          </w:p>
+        </w:tc>
+        <w:tc>
+          <w:tcPr/>
+          <w:p>
+            <w:pPr>
+              <w:pStyle w:val="Compact"/>
+              <w:jc w:val="left"/>
+            </w:pPr>
+            <w:r>
+              <w:t xml:space="preserve">integer</w:t>
+            </w:r>
+          </w:p>
+        </w:tc>
+        <w:tc>
+          <w:tcPr/>
+          <w:p>
+            <w:pPr>
+              <w:pStyle w:val="Compact"/>
+              <w:jc w:val="left"/>
+            </w:pPr>
+            <w:r>
+              <w:t xml:space="preserve">q1_price_mean</w:t>
+            </w:r>
+          </w:p>
+        </w:tc>
+        <w:tc>
+          <w:tcPr/>
+          <w:p>
+            <w:pPr>
+              <w:pStyle w:val="Compact"/>
+              <w:jc w:val="left"/>
+            </w:pPr>
+            <w:r>
+              <w:t xml:space="preserve">float</w:t>
+            </w:r>
+          </w:p>
+        </w:tc>
+        <w:tc>
+          <w:tcPr/>
+          <w:p>
+            <w:pPr>
+              <w:pStyle w:val="Compact"/>
+              <w:jc w:val="left"/>
+            </w:pPr>
+            <w:r>
+              <w:t xml:space="preserve">h1_price_iqr</w:t>
+            </w:r>
+          </w:p>
+        </w:tc>
+        <w:tc>
+          <w:tcPr/>
+          <w:p>
+            <w:pPr>
+              <w:pStyle w:val="Compact"/>
+              <w:jc w:val="left"/>
+            </w:pPr>
+            <w:r>
+              <w:t xml:space="preserve">float</w:t>
+            </w:r>
+          </w:p>
+        </w:tc>
+      </w:tr>
+      <w:tr>
+        <w:tc>
+          <w:tcPr/>
+          <w:p>
+            <w:pPr>
+              <w:pStyle w:val="Compact"/>
+              <w:jc w:val="left"/>
+            </w:pPr>
+            <w:r>
+              <w:t xml:space="preserve">Neighborhood</w:t>
+            </w:r>
+          </w:p>
+        </w:tc>
+        <w:tc>
+          <w:tcPr/>
+          <w:p>
+            <w:pPr>
+              <w:pStyle w:val="Compact"/>
+              <w:jc w:val="left"/>
+            </w:pPr>
+            <w:r>
+              <w:t xml:space="preserve">str</w:t>
+            </w:r>
+          </w:p>
+        </w:tc>
+        <w:tc>
+          <w:tcPr/>
+          <w:p>
+            <w:pPr>
+              <w:pStyle w:val="Compact"/>
+              <w:jc w:val="left"/>
+            </w:pPr>
+            <w:r>
+              <w:t xml:space="preserve">q1_price_median</w:t>
+            </w:r>
+          </w:p>
+        </w:tc>
+        <w:tc>
+          <w:tcPr/>
+          <w:p>
+            <w:pPr>
+              <w:pStyle w:val="Compact"/>
+              <w:jc w:val="left"/>
+            </w:pPr>
+            <w:r>
+              <w:t xml:space="preserve">float</w:t>
+            </w:r>
+          </w:p>
+        </w:tc>
+        <w:tc>
+          <w:tcPr/>
+          <w:p>
+            <w:pPr>
+              <w:pStyle w:val="Compact"/>
+              <w:jc w:val="left"/>
+            </w:pPr>
+            <w:r>
+              <w:t xml:space="preserve">q1_we_days</w:t>
+            </w:r>
+          </w:p>
+        </w:tc>
+        <w:tc>
+          <w:tcPr/>
+          <w:p>
+            <w:pPr>
+              <w:pStyle w:val="Compact"/>
+              <w:jc w:val="left"/>
+            </w:pPr>
+            <w:r>
+              <w:t xml:space="preserve">integer</w:t>
+            </w:r>
+          </w:p>
+        </w:tc>
+      </w:tr>
+      <w:tr>
+        <w:tc>
+          <w:tcPr/>
+          <w:p>
+            <w:pPr>
+              <w:pStyle w:val="Compact"/>
+              <w:jc w:val="left"/>
+            </w:pPr>
+            <w:r>
+              <w:t xml:space="preserve">MetropolitanStatisticalArea</w:t>
+            </w:r>
+          </w:p>
+        </w:tc>
+        <w:tc>
+          <w:tcPr/>
+          <w:p>
+            <w:pPr>
+              <w:pStyle w:val="Compact"/>
+              <w:jc w:val="left"/>
+            </w:pPr>
+            <w:r>
+              <w:t xml:space="preserve">str</w:t>
+            </w:r>
+          </w:p>
+        </w:tc>
+        <w:tc>
+          <w:tcPr/>
+          <w:p>
+            <w:pPr>
+              <w:pStyle w:val="Compact"/>
+              <w:jc w:val="left"/>
+            </w:pPr>
+            <w:r>
+              <w:t xml:space="preserve">q1_price_std</w:t>
+            </w:r>
+          </w:p>
+        </w:tc>
+        <w:tc>
+          <w:tcPr/>
+          <w:p>
+            <w:pPr>
+              <w:pStyle w:val="Compact"/>
+              <w:jc w:val="left"/>
+            </w:pPr>
+            <w:r>
+              <w:t xml:space="preserve">float</w:t>
+            </w:r>
+          </w:p>
+        </w:tc>
+        <w:tc>
+          <w:tcPr/>
+          <w:p>
+            <w:pPr>
+              <w:pStyle w:val="Compact"/>
+              <w:jc w:val="left"/>
+            </w:pPr>
+            <w:r>
+              <w:t xml:space="preserve">q1_we_booked</w:t>
+            </w:r>
+          </w:p>
+        </w:tc>
+        <w:tc>
+          <w:tcPr/>
+          <w:p>
+            <w:pPr>
+              <w:pStyle w:val="Compact"/>
+              <w:jc w:val="left"/>
+            </w:pPr>
+            <w:r>
+              <w:t xml:space="preserve">binary</w:t>
+            </w:r>
+          </w:p>
+        </w:tc>
+      </w:tr>
+      <w:tr>
+        <w:tc>
+          <w:tcPr/>
+          <w:p>
+            <w:pPr>
+              <w:pStyle w:val="Compact"/>
+              <w:jc w:val="left"/>
+            </w:pPr>
+            <w:r>
+              <w:t xml:space="preserve">NumberofReviews</w:t>
+            </w:r>
+          </w:p>
+        </w:tc>
+        <w:tc>
+          <w:tcPr/>
+          <w:p>
+            <w:pPr>
+              <w:pStyle w:val="Compact"/>
+              <w:jc w:val="left"/>
+            </w:pPr>
+            <w:r>
+              <w:t xml:space="preserve">float</w:t>
+            </w:r>
+          </w:p>
+        </w:tc>
+        <w:tc>
+          <w:tcPr/>
+          <w:p>
+            <w:pPr>
+              <w:pStyle w:val="Compact"/>
+              <w:jc w:val="left"/>
+            </w:pPr>
+            <w:r>
+              <w:t xml:space="preserve">q1_price_nunique</w:t>
+            </w:r>
+          </w:p>
+        </w:tc>
+        <w:tc>
+          <w:tcPr/>
+          <w:p>
+            <w:pPr>
+              <w:pStyle w:val="Compact"/>
+              <w:jc w:val="left"/>
+            </w:pPr>
+            <w:r>
+              <w:t xml:space="preserve">integer</w:t>
+            </w:r>
+          </w:p>
+        </w:tc>
+        <w:tc>
+          <w:tcPr/>
+          <w:p>
+            <w:pPr>
+              <w:pStyle w:val="Compact"/>
+              <w:jc w:val="left"/>
+            </w:pPr>
+            <w:r>
+              <w:t xml:space="preserve">q1_we_price_mean</w:t>
+            </w:r>
+          </w:p>
+        </w:tc>
+        <w:tc>
+          <w:tcPr/>
+          <w:p>
+            <w:pPr>
+              <w:pStyle w:val="Compact"/>
+              <w:jc w:val="left"/>
+            </w:pPr>
+            <w:r>
+              <w:t xml:space="preserve">float</w:t>
+            </w:r>
+          </w:p>
+        </w:tc>
+      </w:tr>
+      <w:tr>
+        <w:tc>
+          <w:tcPr/>
+          <w:p>
+            <w:pPr>
+              <w:pStyle w:val="Compact"/>
+              <w:jc w:val="left"/>
+            </w:pPr>
+            <w:r>
+              <w:t xml:space="preserve">OverallRating</w:t>
+            </w:r>
+          </w:p>
+        </w:tc>
+        <w:tc>
+          <w:tcPr/>
+          <w:p>
+            <w:pPr>
+              <w:pStyle w:val="Compact"/>
+              <w:jc w:val="left"/>
+            </w:pPr>
+            <w:r>
+              <w:t xml:space="preserve">float</w:t>
+            </w:r>
+          </w:p>
+        </w:tc>
+        <w:tc>
+          <w:tcPr/>
+          <w:p>
+            <w:pPr>
+              <w:pStyle w:val="Compact"/>
+              <w:jc w:val="left"/>
+            </w:pPr>
+            <w:r>
+              <w:t xml:space="preserve">q1_price_min</w:t>
+            </w:r>
+          </w:p>
+        </w:tc>
+        <w:tc>
+          <w:tcPr/>
+          <w:p>
+            <w:pPr>
+              <w:pStyle w:val="Compact"/>
+              <w:jc w:val="left"/>
+            </w:pPr>
+            <w:r>
+              <w:t xml:space="preserve">float</w:t>
+            </w:r>
+          </w:p>
+        </w:tc>
+        <w:tc>
+          <w:tcPr/>
+          <w:p>
+            <w:pPr>
+              <w:pStyle w:val="Compact"/>
+              <w:jc w:val="left"/>
+            </w:pPr>
+            <w:r>
+              <w:t xml:space="preserve">q1_wd_days</w:t>
+            </w:r>
+          </w:p>
+        </w:tc>
+        <w:tc>
+          <w:tcPr/>
+          <w:p>
+            <w:pPr>
+              <w:pStyle w:val="Compact"/>
+              <w:jc w:val="left"/>
+            </w:pPr>
+            <w:r>
+              <w:t xml:space="preserve">integer</w:t>
+            </w:r>
+          </w:p>
+        </w:tc>
+      </w:tr>
+      <w:tr>
+        <w:tc>
+          <w:tcPr/>
+          <w:p>
+            <w:pPr>
+              <w:pStyle w:val="Compact"/>
+              <w:jc w:val="left"/>
+            </w:pPr>
+            <w:r>
+              <w:t xml:space="preserve">Bedrooms</w:t>
+            </w:r>
+          </w:p>
+        </w:tc>
+        <w:tc>
+          <w:tcPr/>
+          <w:p>
+            <w:pPr>
+              <w:pStyle w:val="Compact"/>
+              <w:jc w:val="left"/>
+            </w:pPr>
+            <w:r>
+              <w:t xml:space="preserve">float</w:t>
+            </w:r>
+          </w:p>
+        </w:tc>
+        <w:tc>
+          <w:tcPr/>
+          <w:p>
+            <w:pPr>
+              <w:pStyle w:val="Compact"/>
+              <w:jc w:val="left"/>
+            </w:pPr>
+            <w:r>
+              <w:t xml:space="preserve">q1_price_max</w:t>
+            </w:r>
+          </w:p>
+        </w:tc>
+        <w:tc>
+          <w:tcPr/>
+          <w:p>
+            <w:pPr>
+              <w:pStyle w:val="Compact"/>
+              <w:jc w:val="left"/>
+            </w:pPr>
+            <w:r>
+              <w:t xml:space="preserve">float</w:t>
+            </w:r>
+          </w:p>
+        </w:tc>
+        <w:tc>
+          <w:tcPr/>
+          <w:p>
+            <w:pPr>
+              <w:pStyle w:val="Compact"/>
+              <w:jc w:val="left"/>
+            </w:pPr>
+            <w:r>
+              <w:t xml:space="preserve">q1_wd_booked</w:t>
+            </w:r>
+          </w:p>
+        </w:tc>
+        <w:tc>
+          <w:tcPr/>
+          <w:p>
+            <w:pPr>
+              <w:pStyle w:val="Compact"/>
+              <w:jc w:val="left"/>
+            </w:pPr>
+            <w:r>
+              <w:t xml:space="preserve">binary</w:t>
+            </w:r>
+          </w:p>
+        </w:tc>
+      </w:tr>
+      <w:tr>
+        <w:tc>
+          <w:tcPr/>
+          <w:p>
+            <w:pPr>
+              <w:pStyle w:val="Compact"/>
+              <w:jc w:val="left"/>
+            </w:pPr>
+            <w:r>
+              <w:t xml:space="preserve">Bathrooms</w:t>
+            </w:r>
+          </w:p>
+        </w:tc>
+        <w:tc>
+          <w:tcPr/>
+          <w:p>
+            <w:pPr>
+              <w:pStyle w:val="Compact"/>
+              <w:jc w:val="left"/>
+            </w:pPr>
+            <w:r>
+              <w:t xml:space="preserve">float</w:t>
+            </w:r>
+          </w:p>
+        </w:tc>
+        <w:tc>
+          <w:tcPr/>
+          <w:p>
+            <w:pPr>
+              <w:pStyle w:val="Compact"/>
+              <w:jc w:val="left"/>
+            </w:pPr>
+            <w:r>
+              <w:t xml:space="preserve">q1_price_q25</w:t>
+            </w:r>
+          </w:p>
+        </w:tc>
+        <w:tc>
+          <w:tcPr/>
+          <w:p>
+            <w:pPr>
+              <w:pStyle w:val="Compact"/>
+              <w:jc w:val="left"/>
+            </w:pPr>
+            <w:r>
+              <w:t xml:space="preserve">float</w:t>
+            </w:r>
+          </w:p>
+        </w:tc>
+        <w:tc>
+          <w:tcPr/>
+          <w:p>
+            <w:pPr>
+              <w:pStyle w:val="Compact"/>
+              <w:jc w:val="left"/>
+            </w:pPr>
+            <w:r>
+              <w:t xml:space="preserve">q1_wd_price_mean</w:t>
+            </w:r>
+          </w:p>
+        </w:tc>
+        <w:tc>
+          <w:tcPr/>
+          <w:p>
+            <w:pPr>
+              <w:pStyle w:val="Compact"/>
+              <w:jc w:val="left"/>
+            </w:pPr>
+            <w:r>
+              <w:t xml:space="preserve">float</w:t>
+            </w:r>
+          </w:p>
+        </w:tc>
+      </w:tr>
+      <w:tr>
+        <w:tc>
+          <w:tcPr/>
+          <w:p>
+            <w:pPr>
+              <w:pStyle w:val="Compact"/>
+              <w:jc w:val="left"/>
+            </w:pPr>
+            <w:r>
+              <w:t xml:space="preserve">MaxGuests</w:t>
+            </w:r>
+          </w:p>
+        </w:tc>
+        <w:tc>
+          <w:tcPr/>
+          <w:p>
+            <w:pPr>
+              <w:pStyle w:val="Compact"/>
+              <w:jc w:val="left"/>
+            </w:pPr>
+            <w:r>
+              <w:t xml:space="preserve">integer</w:t>
+            </w:r>
+          </w:p>
+        </w:tc>
+        <w:tc>
+          <w:tcPr/>
+          <w:p>
+            <w:pPr>
+              <w:pStyle w:val="Compact"/>
+              <w:jc w:val="left"/>
+            </w:pPr>
+            <w:r>
+              <w:t xml:space="preserve">q1_price_q75</w:t>
+            </w:r>
+          </w:p>
+        </w:tc>
+        <w:tc>
+          <w:tcPr/>
+          <w:p>
+            <w:pPr>
+              <w:pStyle w:val="Compact"/>
+              <w:jc w:val="left"/>
+            </w:pPr>
+            <w:r>
+              <w:t xml:space="preserve">float</w:t>
+            </w:r>
+          </w:p>
+        </w:tc>
+        <w:tc>
+          <w:tcPr/>
+          <w:p>
+            <w:pPr>
+              <w:pStyle w:val="Compact"/>
+              <w:jc w:val="left"/>
+            </w:pPr>
+            <w:r>
+              <w:t xml:space="preserve">q1_we_booking_rate</w:t>
+            </w:r>
+          </w:p>
+        </w:tc>
+        <w:tc>
+          <w:tcPr/>
+          <w:p>
+            <w:pPr>
+              <w:pStyle w:val="Compact"/>
+              <w:jc w:val="left"/>
+            </w:pPr>
+            <w:r>
+              <w:t xml:space="preserve">float</w:t>
+            </w:r>
+          </w:p>
+        </w:tc>
+      </w:tr>
+      <w:tr>
+        <w:tc>
+          <w:tcPr/>
+          <w:p>
+            <w:pPr>
+              <w:pStyle w:val="Compact"/>
+              <w:jc w:val="left"/>
+            </w:pPr>
+            <w:r>
+              <w:t xml:space="preserve">ResponseRate</w:t>
+            </w:r>
+          </w:p>
+        </w:tc>
+        <w:tc>
+          <w:tcPr/>
+          <w:p>
+            <w:pPr>
+              <w:pStyle w:val="Compact"/>
+              <w:jc w:val="left"/>
+            </w:pPr>
+            <w:r>
+              <w:t xml:space="preserve">float</w:t>
+            </w:r>
+          </w:p>
+        </w:tc>
+        <w:tc>
+          <w:tcPr/>
+          <w:p>
+            <w:pPr>
+              <w:pStyle w:val="Compact"/>
+              <w:jc w:val="left"/>
+            </w:pPr>
+            <w:r>
+              <w:t xml:space="preserve">q1_booking_rate</w:t>
+            </w:r>
+          </w:p>
+        </w:tc>
+        <w:tc>
+          <w:tcPr/>
+          <w:p>
+            <w:pPr>
+              <w:pStyle w:val="Compact"/>
+              <w:jc w:val="left"/>
+            </w:pPr>
+            <w:r>
+              <w:t xml:space="preserve">float</w:t>
+            </w:r>
+          </w:p>
+        </w:tc>
+        <w:tc>
+          <w:tcPr/>
+          <w:p>
+            <w:pPr>
+              <w:pStyle w:val="Compact"/>
+              <w:jc w:val="left"/>
+            </w:pPr>
+            <w:r>
+              <w:t xml:space="preserve">q1_wd_booking_rate</w:t>
+            </w:r>
+          </w:p>
+        </w:tc>
+        <w:tc>
+          <w:tcPr/>
+          <w:p>
+            <w:pPr>
+              <w:pStyle w:val="Compact"/>
+              <w:jc w:val="left"/>
+            </w:pPr>
+            <w:r>
+              <w:t xml:space="preserve">float</w:t>
+            </w:r>
+          </w:p>
+        </w:tc>
+      </w:tr>
+      <w:tr>
+        <w:tc>
+          <w:tcPr/>
+          <w:p>
+            <w:pPr>
+              <w:pStyle w:val="Compact"/>
+              <w:jc w:val="left"/>
+            </w:pPr>
+            <w:r>
+              <w:t xml:space="preserve">ResponseTimemin</w:t>
+            </w:r>
+          </w:p>
+        </w:tc>
+        <w:tc>
+          <w:tcPr/>
+          <w:p>
+            <w:pPr>
+              <w:pStyle w:val="Compact"/>
+              <w:jc w:val="left"/>
+            </w:pPr>
+            <w:r>
+              <w:t xml:space="preserve">float</w:t>
+            </w:r>
+          </w:p>
+        </w:tc>
+        <w:tc>
+          <w:tcPr/>
+          <w:p>
+            <w:pPr>
+              <w:pStyle w:val="Compact"/>
+              <w:jc w:val="left"/>
+            </w:pPr>
+            <w:r>
+              <w:t xml:space="preserve">q1_available_rate</w:t>
+            </w:r>
+          </w:p>
+        </w:tc>
+        <w:tc>
+          <w:tcPr/>
+          <w:p>
+            <w:pPr>
+              <w:pStyle w:val="Compact"/>
+              <w:jc w:val="left"/>
+            </w:pPr>
+            <w:r>
+              <w:t xml:space="preserve">float</w:t>
+            </w:r>
+          </w:p>
+        </w:tc>
+        <w:tc>
+          <w:tcPr/>
+          <w:p>
+            <w:pPr>
+              <w:pStyle w:val="Compact"/>
+              <w:jc w:val="left"/>
+            </w:pPr>
+            <w:r>
+              <w:t xml:space="preserve">q1_weekend_premium</w:t>
+            </w:r>
+          </w:p>
+        </w:tc>
+        <w:tc>
+          <w:tcPr/>
+          <w:p>
+            <w:pPr>
+              <w:pStyle w:val="Compact"/>
+              <w:jc w:val="left"/>
+            </w:pPr>
+            <w:r>
+              <w:t xml:space="preserve">float</w:t>
+            </w:r>
+          </w:p>
+        </w:tc>
+      </w:tr>
+      <w:tr>
+        <w:tc>
+          <w:tcPr/>
+          <w:p>
+            <w:pPr>
+              <w:pStyle w:val="Compact"/>
+              <w:jc w:val="left"/>
+            </w:pPr>
+            <w:r>
+              <w:t xml:space="preserve">Superhost</w:t>
+            </w:r>
+          </w:p>
+        </w:tc>
+        <w:tc>
+          <w:tcPr/>
+          <w:p>
+            <w:pPr>
+              <w:pStyle w:val="Compact"/>
+              <w:jc w:val="left"/>
+            </w:pPr>
+            <w:r>
+              <w:t xml:space="preserve">float</w:t>
+            </w:r>
+          </w:p>
+        </w:tc>
+        <w:tc>
+          <w:tcPr/>
+          <w:p>
+            <w:pPr>
+              <w:pStyle w:val="Compact"/>
+              <w:jc w:val="left"/>
+            </w:pPr>
+            <w:r>
+              <w:t xml:space="preserve">q1_reserved_rate</w:t>
+            </w:r>
+          </w:p>
+        </w:tc>
+        <w:tc>
+          <w:tcPr/>
+          <w:p>
+            <w:pPr>
+              <w:pStyle w:val="Compact"/>
+              <w:jc w:val="left"/>
+            </w:pPr>
+            <w:r>
+              <w:t xml:space="preserve">float</w:t>
+            </w:r>
+          </w:p>
+        </w:tc>
+        <w:tc>
+          <w:tcPr/>
+          <w:p>
+            <w:pPr>
+              <w:pStyle w:val="Compact"/>
+              <w:jc w:val="left"/>
+            </w:pPr>
+            <w:r>
+              <w:t xml:space="preserve">q1_weekend_minus_weekday_book_rate</w:t>
+            </w:r>
+          </w:p>
+        </w:tc>
+        <w:tc>
+          <w:tcPr/>
+          <w:p>
+            <w:pPr>
+              <w:pStyle w:val="Compact"/>
+              <w:jc w:val="left"/>
+            </w:pPr>
+            <w:r>
+              <w:t xml:space="preserve">float</w:t>
+            </w:r>
+          </w:p>
+        </w:tc>
+      </w:tr>
+      <w:tr>
+        <w:tc>
+          <w:tcPr/>
+          <w:p>
+            <w:pPr>
+              <w:pStyle w:val="Compact"/>
+              <w:jc w:val="left"/>
+            </w:pPr>
+            <w:r>
+              <w:t xml:space="preserve">CancellationPolicy</w:t>
+            </w:r>
+          </w:p>
+        </w:tc>
+        <w:tc>
+          <w:tcPr/>
+          <w:p>
+            <w:pPr>
+              <w:pStyle w:val="Compact"/>
+              <w:jc w:val="left"/>
+            </w:pPr>
+            <w:r>
+              <w:t xml:space="preserve">str</w:t>
+            </w:r>
+          </w:p>
+        </w:tc>
+        <w:tc>
+          <w:tcPr/>
+          <w:p>
+            <w:pPr>
+              <w:pStyle w:val="Compact"/>
+              <w:jc w:val="left"/>
+            </w:pPr>
+            <w:r>
+              <w:t xml:space="preserve">q1_price_range</w:t>
+            </w:r>
+          </w:p>
+        </w:tc>
+        <w:tc>
+          <w:tcPr/>
+          <w:p>
+            <w:pPr>
+              <w:pStyle w:val="Compact"/>
+              <w:jc w:val="left"/>
+            </w:pPr>
+            <w:r>
+              <w:t xml:space="preserve">float</w:t>
+            </w:r>
+          </w:p>
+        </w:tc>
+        <w:tc>
+          <w:tcPr/>
+          <w:p>
+            <w:pPr>
+              <w:pStyle w:val="Compact"/>
+              <w:jc w:val="left"/>
+            </w:pPr>
+            <w:r>
+              <w:t xml:space="preserve">q2_we_days</w:t>
+            </w:r>
+          </w:p>
+        </w:tc>
+        <w:tc>
+          <w:tcPr/>
+          <w:p>
+            <w:pPr>
+              <w:pStyle w:val="Compact"/>
+              <w:jc w:val="left"/>
+            </w:pPr>
+            <w:r>
+              <w:t xml:space="preserve">integer</w:t>
+            </w:r>
+          </w:p>
+        </w:tc>
+      </w:tr>
+      <w:tr>
+        <w:tc>
+          <w:tcPr/>
+          <w:p>
+            <w:pPr>
+              <w:pStyle w:val="Compact"/>
+              <w:jc w:val="left"/>
+            </w:pPr>
+            <w:r>
+              <w:t xml:space="preserve">SecurityDeposit</w:t>
+            </w:r>
+          </w:p>
+        </w:tc>
+        <w:tc>
+          <w:tcPr/>
+          <w:p>
+            <w:pPr>
+              <w:pStyle w:val="Compact"/>
+              <w:jc w:val="left"/>
+            </w:pPr>
+            <w:r>
+              <w:t xml:space="preserve">float</w:t>
+            </w:r>
+          </w:p>
+        </w:tc>
+        <w:tc>
+          <w:tcPr/>
+          <w:p>
+            <w:pPr>
+              <w:pStyle w:val="Compact"/>
+              <w:jc w:val="left"/>
+            </w:pPr>
+            <w:r>
+              <w:t xml:space="preserve">q1_price_cv</w:t>
+            </w:r>
+          </w:p>
+        </w:tc>
+        <w:tc>
+          <w:tcPr/>
+          <w:p>
+            <w:pPr>
+              <w:pStyle w:val="Compact"/>
+              <w:jc w:val="left"/>
+            </w:pPr>
+            <w:r>
+              <w:t xml:space="preserve">float</w:t>
+            </w:r>
+          </w:p>
+        </w:tc>
+        <w:tc>
+          <w:tcPr/>
+          <w:p>
+            <w:pPr>
+              <w:pStyle w:val="Compact"/>
+              <w:jc w:val="left"/>
+            </w:pPr>
+            <w:r>
+              <w:t xml:space="preserve">q2_we_booked</w:t>
+            </w:r>
+          </w:p>
+        </w:tc>
+        <w:tc>
+          <w:tcPr/>
+          <w:p>
+            <w:pPr>
+              <w:pStyle w:val="Compact"/>
+              <w:jc w:val="left"/>
+            </w:pPr>
+            <w:r>
+              <w:t xml:space="preserve">binary</w:t>
+            </w:r>
+          </w:p>
+        </w:tc>
+      </w:tr>
+      <w:tr>
+        <w:tc>
+          <w:tcPr/>
+          <w:p>
+            <w:pPr>
+              <w:pStyle w:val="Compact"/>
+              <w:jc w:val="left"/>
+            </w:pPr>
+            <w:r>
+              <w:t xml:space="preserve">CleaningFee</w:t>
+            </w:r>
+          </w:p>
+        </w:tc>
+        <w:tc>
+          <w:tcPr/>
+          <w:p>
+            <w:pPr>
+              <w:pStyle w:val="Compact"/>
+              <w:jc w:val="left"/>
+            </w:pPr>
+            <w:r>
+              <w:t xml:space="preserve">float</w:t>
+            </w:r>
+          </w:p>
+        </w:tc>
+        <w:tc>
+          <w:tcPr/>
+          <w:p>
+            <w:pPr>
+              <w:pStyle w:val="Compact"/>
+              <w:jc w:val="left"/>
+            </w:pPr>
+            <w:r>
+              <w:t xml:space="preserve">q1_price_iqr</w:t>
+            </w:r>
+          </w:p>
+        </w:tc>
+        <w:tc>
+          <w:tcPr/>
+          <w:p>
+            <w:pPr>
+              <w:pStyle w:val="Compact"/>
+              <w:jc w:val="left"/>
+            </w:pPr>
+            <w:r>
+              <w:t xml:space="preserve">float</w:t>
+            </w:r>
+          </w:p>
+        </w:tc>
+        <w:tc>
+          <w:tcPr/>
+          <w:p>
+            <w:pPr>
+              <w:pStyle w:val="Compact"/>
+              <w:jc w:val="left"/>
+            </w:pPr>
+            <w:r>
+              <w:t xml:space="preserve">q2_we_price_mean</w:t>
+            </w:r>
+          </w:p>
+        </w:tc>
+        <w:tc>
+          <w:tcPr/>
+          <w:p>
+            <w:pPr>
+              <w:pStyle w:val="Compact"/>
+              <w:jc w:val="left"/>
+            </w:pPr>
+            <w:r>
+              <w:t xml:space="preserve">float</w:t>
+            </w:r>
+          </w:p>
+        </w:tc>
+      </w:tr>
+      <w:tr>
+        <w:tc>
+          <w:tcPr/>
+          <w:p>
+            <w:pPr>
+              <w:pStyle w:val="Compact"/>
+              <w:jc w:val="left"/>
+            </w:pPr>
+            <w:r>
+              <w:t xml:space="preserve">ExtraPeopleFee</w:t>
+            </w:r>
+          </w:p>
+        </w:tc>
+        <w:tc>
+          <w:tcPr/>
+          <w:p>
+            <w:pPr>
+              <w:pStyle w:val="Compact"/>
+              <w:jc w:val="left"/>
+            </w:pPr>
+            <w:r>
+              <w:t xml:space="preserve">float</w:t>
+            </w:r>
+          </w:p>
+        </w:tc>
+        <w:tc>
+          <w:tcPr/>
+          <w:p>
+            <w:pPr>
+              <w:pStyle w:val="Compact"/>
+              <w:jc w:val="left"/>
+            </w:pPr>
+            <w:r>
+              <w:t xml:space="preserve">q2_days_total</w:t>
+            </w:r>
+          </w:p>
+        </w:tc>
+        <w:tc>
+          <w:tcPr/>
+          <w:p>
+            <w:pPr>
+              <w:pStyle w:val="Compact"/>
+              <w:jc w:val="left"/>
+            </w:pPr>
+            <w:r>
+              <w:t xml:space="preserve">integer</w:t>
+            </w:r>
+          </w:p>
+        </w:tc>
+        <w:tc>
+          <w:tcPr/>
+          <w:p>
+            <w:pPr>
+              <w:pStyle w:val="Compact"/>
+              <w:jc w:val="left"/>
+            </w:pPr>
+            <w:r>
+              <w:t xml:space="preserve">q2_wd_days</w:t>
+            </w:r>
+          </w:p>
+        </w:tc>
+        <w:tc>
+          <w:tcPr/>
+          <w:p>
+            <w:pPr>
+              <w:pStyle w:val="Compact"/>
+              <w:jc w:val="left"/>
+            </w:pPr>
+            <w:r>
+              <w:t xml:space="preserve">integer</w:t>
+            </w:r>
+          </w:p>
+        </w:tc>
+      </w:tr>
+      <w:tr>
+        <w:tc>
+          <w:tcPr/>
+          <w:p>
+            <w:pPr>
+              <w:pStyle w:val="Compact"/>
+              <w:jc w:val="left"/>
+            </w:pPr>
+            <w:r>
+              <w:t xml:space="preserve">PublishedNightlyRate</w:t>
+            </w:r>
+          </w:p>
+        </w:tc>
+        <w:tc>
+          <w:tcPr/>
+          <w:p>
+            <w:pPr>
+              <w:pStyle w:val="Compact"/>
+              <w:jc w:val="left"/>
+            </w:pPr>
+            <w:r>
+              <w:t xml:space="preserve">integer</w:t>
+            </w:r>
+          </w:p>
+        </w:tc>
+        <w:tc>
+          <w:tcPr/>
+          <w:p>
+            <w:pPr>
+              <w:pStyle w:val="Compact"/>
+              <w:jc w:val="left"/>
+            </w:pPr>
+            <w:r>
+              <w:t xml:space="preserve">q2_days_A</w:t>
+            </w:r>
+          </w:p>
+        </w:tc>
+        <w:tc>
+          <w:tcPr/>
+          <w:p>
+            <w:pPr>
+              <w:pStyle w:val="Compact"/>
+              <w:jc w:val="left"/>
+            </w:pPr>
+            <w:r>
+              <w:t xml:space="preserve">binary</w:t>
+            </w:r>
+          </w:p>
+        </w:tc>
+        <w:tc>
+          <w:tcPr/>
+          <w:p>
+            <w:pPr>
+              <w:pStyle w:val="Compact"/>
+              <w:jc w:val="left"/>
+            </w:pPr>
+            <w:r>
+              <w:t xml:space="preserve">q2_wd_booked</w:t>
+            </w:r>
+          </w:p>
+        </w:tc>
+        <w:tc>
+          <w:tcPr/>
+          <w:p>
+            <w:pPr>
+              <w:pStyle w:val="Compact"/>
+              <w:jc w:val="left"/>
+            </w:pPr>
+            <w:r>
+              <w:t xml:space="preserve">binary</w:t>
+            </w:r>
+          </w:p>
+        </w:tc>
+      </w:tr>
+      <w:tr>
+        <w:tc>
+          <w:tcPr/>
+          <w:p>
+            <w:pPr>
+              <w:pStyle w:val="Compact"/>
+              <w:jc w:val="left"/>
+            </w:pPr>
+            <w:r>
+              <w:t xml:space="preserve">PublishedMonthlyRate</w:t>
+            </w:r>
+          </w:p>
+        </w:tc>
+        <w:tc>
+          <w:tcPr/>
+          <w:p>
+            <w:pPr>
+              <w:pStyle w:val="Compact"/>
+              <w:jc w:val="left"/>
+            </w:pPr>
+            <w:r>
+              <w:t xml:space="preserve">float</w:t>
+            </w:r>
+          </w:p>
+        </w:tc>
+        <w:tc>
+          <w:tcPr/>
+          <w:p>
+            <w:pPr>
+              <w:pStyle w:val="Compact"/>
+              <w:jc w:val="left"/>
+            </w:pPr>
+            <w:r>
+              <w:t xml:space="preserve">q2_days_B</w:t>
+            </w:r>
+          </w:p>
+        </w:tc>
+        <w:tc>
+          <w:tcPr/>
+          <w:p>
+            <w:pPr>
+              <w:pStyle w:val="Compact"/>
+              <w:jc w:val="left"/>
+            </w:pPr>
+            <w:r>
+              <w:t xml:space="preserve">binary</w:t>
+            </w:r>
+          </w:p>
+        </w:tc>
+        <w:tc>
+          <w:tcPr/>
+          <w:p>
+            <w:pPr>
+              <w:pStyle w:val="Compact"/>
+              <w:jc w:val="left"/>
+            </w:pPr>
+            <w:r>
+              <w:t xml:space="preserve">q2_wd_price_mean</w:t>
+            </w:r>
+          </w:p>
+        </w:tc>
+        <w:tc>
+          <w:tcPr/>
+          <w:p>
+            <w:pPr>
+              <w:pStyle w:val="Compact"/>
+              <w:jc w:val="left"/>
+            </w:pPr>
+            <w:r>
+              <w:t xml:space="preserve">float</w:t>
+            </w:r>
+          </w:p>
+        </w:tc>
+      </w:tr>
+      <w:tr>
+        <w:tc>
+          <w:tcPr/>
+          <w:p>
+            <w:pPr>
+              <w:pStyle w:val="Compact"/>
+              <w:jc w:val="left"/>
+            </w:pPr>
+            <w:r>
+              <w:t xml:space="preserve">PublishedWeeklyRate</w:t>
+            </w:r>
+          </w:p>
+        </w:tc>
+        <w:tc>
+          <w:tcPr/>
+          <w:p>
+            <w:pPr>
+              <w:pStyle w:val="Compact"/>
+              <w:jc w:val="left"/>
+            </w:pPr>
+            <w:r>
+              <w:t xml:space="preserve">float</w:t>
+            </w:r>
+          </w:p>
+        </w:tc>
+        <w:tc>
+          <w:tcPr/>
+          <w:p>
+            <w:pPr>
+              <w:pStyle w:val="Compact"/>
+              <w:jc w:val="left"/>
+            </w:pPr>
+            <w:r>
+              <w:t xml:space="preserve">q2_days_R</w:t>
+            </w:r>
+          </w:p>
+        </w:tc>
+        <w:tc>
+          <w:tcPr/>
+          <w:p>
+            <w:pPr>
+              <w:pStyle w:val="Compact"/>
+              <w:jc w:val="left"/>
+            </w:pPr>
+            <w:r>
+              <w:t xml:space="preserve">binary</w:t>
+            </w:r>
+          </w:p>
+        </w:tc>
+        <w:tc>
+          <w:tcPr/>
+          <w:p>
+            <w:pPr>
+              <w:pStyle w:val="Compact"/>
+              <w:jc w:val="left"/>
+            </w:pPr>
+            <w:r>
+              <w:t xml:space="preserve">q2_we_booking_rate</w:t>
+            </w:r>
+          </w:p>
+        </w:tc>
+        <w:tc>
+          <w:tcPr/>
+          <w:p>
+            <w:pPr>
+              <w:pStyle w:val="Compact"/>
+              <w:jc w:val="left"/>
+            </w:pPr>
+            <w:r>
+              <w:t xml:space="preserve">float</w:t>
+            </w:r>
+          </w:p>
+        </w:tc>
+      </w:tr>
+      <w:tr>
+        <w:tc>
+          <w:tcPr/>
+          <w:p>
+            <w:pPr>
+              <w:pStyle w:val="Compact"/>
+              <w:jc w:val="left"/>
+            </w:pPr>
+            <w:r>
+              <w:t xml:space="preserve">MinimumStay</w:t>
+            </w:r>
+          </w:p>
+        </w:tc>
+        <w:tc>
+          <w:tcPr/>
+          <w:p>
+            <w:pPr>
+              <w:pStyle w:val="Compact"/>
+              <w:jc w:val="left"/>
+            </w:pPr>
+            <w:r>
+              <w:t xml:space="preserve">integer</w:t>
+            </w:r>
+          </w:p>
+        </w:tc>
+        <w:tc>
+          <w:tcPr/>
+          <w:p>
+            <w:pPr>
+              <w:pStyle w:val="Compact"/>
+              <w:jc w:val="left"/>
+            </w:pPr>
+            <w:r>
+              <w:t xml:space="preserve">q2_unique_reservations</w:t>
+            </w:r>
+          </w:p>
+        </w:tc>
+        <w:tc>
+          <w:tcPr/>
+          <w:p>
+            <w:pPr>
+              <w:pStyle w:val="Compact"/>
+              <w:jc w:val="left"/>
+            </w:pPr>
+            <w:r>
+              <w:t xml:space="preserve">integer</w:t>
+            </w:r>
+          </w:p>
+        </w:tc>
+        <w:tc>
+          <w:tcPr/>
+          <w:p>
+            <w:pPr>
+              <w:pStyle w:val="Compact"/>
+              <w:jc w:val="left"/>
+            </w:pPr>
+            <w:r>
+              <w:t xml:space="preserve">q2_wd_booking_rate</w:t>
+            </w:r>
+          </w:p>
+        </w:tc>
+        <w:tc>
+          <w:tcPr/>
+          <w:p>
+            <w:pPr>
+              <w:pStyle w:val="Compact"/>
+              <w:jc w:val="left"/>
+            </w:pPr>
+            <w:r>
+              <w:t xml:space="preserve">float</w:t>
+            </w:r>
+          </w:p>
+        </w:tc>
+      </w:tr>
+      <w:tr>
+        <w:tc>
+          <w:tcPr/>
+          <w:p>
+            <w:pPr>
+              <w:pStyle w:val="Compact"/>
+              <w:jc w:val="left"/>
+            </w:pPr>
+            <w:r>
+              <w:t xml:space="preserve">NumberofPhotos</w:t>
+            </w:r>
+          </w:p>
+        </w:tc>
+        <w:tc>
+          <w:tcPr/>
+          <w:p>
+            <w:pPr>
+              <w:pStyle w:val="Compact"/>
+              <w:jc w:val="left"/>
+            </w:pPr>
+            <w:r>
+              <w:t xml:space="preserve">float</w:t>
+            </w:r>
+          </w:p>
+        </w:tc>
+        <w:tc>
+          <w:tcPr/>
+          <w:p>
+            <w:pPr>
+              <w:pStyle w:val="Compact"/>
+              <w:jc w:val="left"/>
+            </w:pPr>
+            <w:r>
+              <w:t xml:space="preserve">q2_price_mean</w:t>
+            </w:r>
+          </w:p>
+        </w:tc>
+        <w:tc>
+          <w:tcPr/>
+          <w:p>
+            <w:pPr>
+              <w:pStyle w:val="Compact"/>
+              <w:jc w:val="left"/>
+            </w:pPr>
+            <w:r>
+              <w:t xml:space="preserve">float</w:t>
+            </w:r>
+          </w:p>
+        </w:tc>
+        <w:tc>
+          <w:tcPr/>
+          <w:p>
+            <w:pPr>
+              <w:pStyle w:val="Compact"/>
+              <w:jc w:val="left"/>
+            </w:pPr>
+            <w:r>
+              <w:t xml:space="preserve">q2_weekend_premium</w:t>
+            </w:r>
+          </w:p>
+        </w:tc>
+        <w:tc>
+          <w:tcPr/>
+          <w:p>
+            <w:pPr>
+              <w:pStyle w:val="Compact"/>
+              <w:jc w:val="left"/>
+            </w:pPr>
+            <w:r>
+              <w:t xml:space="preserve">float</w:t>
+            </w:r>
+          </w:p>
+        </w:tc>
+      </w:tr>
+      <w:tr>
+        <w:tc>
+          <w:tcPr/>
+          <w:p>
+            <w:pPr>
+              <w:pStyle w:val="Compact"/>
+              <w:jc w:val="left"/>
+            </w:pPr>
+            <w:r>
+              <w:t xml:space="preserve">BusinessReady</w:t>
+            </w:r>
+          </w:p>
+        </w:tc>
+        <w:tc>
+          <w:tcPr/>
+          <w:p>
+            <w:pPr>
+              <w:pStyle w:val="Compact"/>
+              <w:jc w:val="left"/>
+            </w:pPr>
+            <w:r>
+              <w:t xml:space="preserve">float</w:t>
+            </w:r>
+          </w:p>
+        </w:tc>
+        <w:tc>
+          <w:tcPr/>
+          <w:p>
+            <w:pPr>
+              <w:pStyle w:val="Compact"/>
+              <w:jc w:val="left"/>
+            </w:pPr>
+            <w:r>
+              <w:t xml:space="preserve">q2_price_median</w:t>
+            </w:r>
+          </w:p>
+        </w:tc>
+        <w:tc>
+          <w:tcPr/>
+          <w:p>
+            <w:pPr>
+              <w:pStyle w:val="Compact"/>
+              <w:jc w:val="left"/>
+            </w:pPr>
+            <w:r>
+              <w:t xml:space="preserve">float</w:t>
+            </w:r>
+          </w:p>
+        </w:tc>
+        <w:tc>
+          <w:tcPr/>
+          <w:p>
+            <w:pPr>
+              <w:pStyle w:val="Compact"/>
+              <w:jc w:val="left"/>
+            </w:pPr>
+            <w:r>
+              <w:t xml:space="preserve">q2_weekend_minus_weekday_book_rate</w:t>
+            </w:r>
+          </w:p>
+        </w:tc>
+        <w:tc>
+          <w:tcPr/>
+          <w:p>
+            <w:pPr>
+              <w:pStyle w:val="Compact"/>
+              <w:jc w:val="left"/>
+            </w:pPr>
+            <w:r>
+              <w:t xml:space="preserve">float</w:t>
+            </w:r>
+          </w:p>
+        </w:tc>
+      </w:tr>
+      <w:tr>
+        <w:tc>
+          <w:tcPr/>
+          <w:p>
+            <w:pPr>
+              <w:pStyle w:val="Compact"/>
+              <w:jc w:val="left"/>
+            </w:pPr>
+            <w:r>
+              <w:t xml:space="preserve">InstantbookEnabled</w:t>
+            </w:r>
+          </w:p>
+        </w:tc>
+        <w:tc>
+          <w:tcPr/>
+          <w:p>
+            <w:pPr>
+              <w:pStyle w:val="Compact"/>
+              <w:jc w:val="left"/>
+            </w:pPr>
+            <w:r>
+              <w:t xml:space="preserve">float</w:t>
+            </w:r>
+          </w:p>
+        </w:tc>
+        <w:tc>
+          <w:tcPr/>
+          <w:p>
+            <w:pPr>
+              <w:pStyle w:val="Compact"/>
+              <w:jc w:val="left"/>
+            </w:pPr>
+            <w:r>
+              <w:t xml:space="preserve">q2_price_std</w:t>
+            </w:r>
+          </w:p>
+        </w:tc>
+        <w:tc>
+          <w:tcPr/>
+          <w:p>
+            <w:pPr>
+              <w:pStyle w:val="Compact"/>
+              <w:jc w:val="left"/>
+            </w:pPr>
+            <w:r>
+              <w:t xml:space="preserve">float</w:t>
+            </w:r>
+          </w:p>
+        </w:tc>
+        <w:tc>
+          <w:tcPr/>
+          <w:p>
+            <w:pPr>
+              <w:pStyle w:val="Compact"/>
+              <w:jc w:val="left"/>
+            </w:pPr>
+            <w:r>
+              <w:t xml:space="preserve">q1_booked_m1</w:t>
+            </w:r>
+          </w:p>
+        </w:tc>
+        <w:tc>
+          <w:tcPr/>
+          <w:p>
+            <w:pPr>
+              <w:pStyle w:val="Compact"/>
+              <w:jc w:val="left"/>
+            </w:pPr>
+            <w:r>
+              <w:t xml:space="preserve">binary</w:t>
+            </w:r>
+          </w:p>
+        </w:tc>
+      </w:tr>
+      <w:tr>
+        <w:tc>
+          <w:tcPr/>
+          <w:p>
+            <w:pPr>
+              <w:pStyle w:val="Compact"/>
+              <w:jc w:val="left"/>
+            </w:pPr>
+            <w:r>
+              <w:t xml:space="preserve">Latitude</w:t>
+            </w:r>
+          </w:p>
+        </w:tc>
+        <w:tc>
+          <w:tcPr/>
+          <w:p>
+            <w:pPr>
+              <w:pStyle w:val="Compact"/>
+              <w:jc w:val="left"/>
+            </w:pPr>
+            <w:r>
+              <w:t xml:space="preserve">float</w:t>
+            </w:r>
+          </w:p>
+        </w:tc>
+        <w:tc>
+          <w:tcPr/>
+          <w:p>
+            <w:pPr>
+              <w:pStyle w:val="Compact"/>
+              <w:jc w:val="left"/>
+            </w:pPr>
+            <w:r>
+              <w:t xml:space="preserve">q2_price_nunique</w:t>
+            </w:r>
+          </w:p>
+        </w:tc>
+        <w:tc>
+          <w:tcPr/>
+          <w:p>
+            <w:pPr>
+              <w:pStyle w:val="Compact"/>
+              <w:jc w:val="left"/>
+            </w:pPr>
+            <w:r>
+              <w:t xml:space="preserve">integer</w:t>
+            </w:r>
+          </w:p>
+        </w:tc>
+        <w:tc>
+          <w:tcPr/>
+          <w:p>
+            <w:pPr>
+              <w:pStyle w:val="Compact"/>
+              <w:jc w:val="left"/>
+            </w:pPr>
+            <w:r>
+              <w:t xml:space="preserve">q1_booked_m2</w:t>
+            </w:r>
+          </w:p>
+        </w:tc>
+        <w:tc>
+          <w:tcPr/>
+          <w:p>
+            <w:pPr>
+              <w:pStyle w:val="Compact"/>
+              <w:jc w:val="left"/>
+            </w:pPr>
+            <w:r>
+              <w:t xml:space="preserve">binary</w:t>
+            </w:r>
+          </w:p>
+        </w:tc>
+      </w:tr>
+      <w:tr>
+        <w:tc>
+          <w:tcPr/>
+          <w:p>
+            <w:pPr>
+              <w:pStyle w:val="Compact"/>
+              <w:jc w:val="left"/>
+            </w:pPr>
+            <w:r>
+              <w:t xml:space="preserve">Longitude</w:t>
+            </w:r>
+          </w:p>
+        </w:tc>
+        <w:tc>
+          <w:tcPr/>
+          <w:p>
+            <w:pPr>
+              <w:pStyle w:val="Compact"/>
+              <w:jc w:val="left"/>
+            </w:pPr>
+            <w:r>
+              <w:t xml:space="preserve">float</w:t>
+            </w:r>
+          </w:p>
+        </w:tc>
+        <w:tc>
+          <w:tcPr/>
+          <w:p>
+            <w:pPr>
+              <w:pStyle w:val="Compact"/>
+              <w:jc w:val="left"/>
+            </w:pPr>
+            <w:r>
+              <w:t xml:space="preserve">q2_price_min</w:t>
+            </w:r>
+          </w:p>
+        </w:tc>
+        <w:tc>
+          <w:tcPr/>
+          <w:p>
+            <w:pPr>
+              <w:pStyle w:val="Compact"/>
+              <w:jc w:val="left"/>
+            </w:pPr>
+            <w:r>
+              <w:t xml:space="preserve">float</w:t>
+            </w:r>
+          </w:p>
+        </w:tc>
+        <w:tc>
+          <w:tcPr/>
+          <w:p>
+            <w:pPr>
+              <w:pStyle w:val="Compact"/>
+              <w:jc w:val="left"/>
+            </w:pPr>
+            <w:r>
+              <w:t xml:space="preserve">q1_booked_m3</w:t>
+            </w:r>
+          </w:p>
+        </w:tc>
+        <w:tc>
+          <w:tcPr/>
+          <w:p>
+            <w:pPr>
+              <w:pStyle w:val="Compact"/>
+              <w:jc w:val="left"/>
+            </w:pPr>
+            <w:r>
+              <w:t xml:space="preserve">binary</w:t>
+            </w:r>
+          </w:p>
+        </w:tc>
+      </w:tr>
+      <w:tr>
+        <w:tc>
+          <w:tcPr/>
+          <w:p>
+            <w:pPr>
+              <w:pStyle w:val="Compact"/>
+              <w:jc w:val="left"/>
+            </w:pPr>
+            <w:r>
+              <w:t xml:space="preserve">PropertyAgeDays</w:t>
+            </w:r>
+          </w:p>
+        </w:tc>
+        <w:tc>
+          <w:tcPr/>
+          <w:p>
+            <w:pPr>
+              <w:pStyle w:val="Compact"/>
+              <w:jc w:val="left"/>
+            </w:pPr>
+            <w:r>
+              <w:t xml:space="preserve">integer</w:t>
+            </w:r>
+          </w:p>
+        </w:tc>
+        <w:tc>
+          <w:tcPr/>
+          <w:p>
+            <w:pPr>
+              <w:pStyle w:val="Compact"/>
+              <w:jc w:val="left"/>
+            </w:pPr>
+            <w:r>
+              <w:t xml:space="preserve">q2_price_max</w:t>
+            </w:r>
+          </w:p>
+        </w:tc>
+        <w:tc>
+          <w:tcPr/>
+          <w:p>
+            <w:pPr>
+              <w:pStyle w:val="Compact"/>
+              <w:jc w:val="left"/>
+            </w:pPr>
+            <w:r>
+              <w:t xml:space="preserve">float</w:t>
+            </w:r>
+          </w:p>
+        </w:tc>
+        <w:tc>
+          <w:tcPr/>
+          <w:p>
+            <w:pPr>
+              <w:pStyle w:val="Compact"/>
+              <w:jc w:val="left"/>
+            </w:pPr>
+            <w:r>
+              <w:t xml:space="preserve">q2_booked_m4</w:t>
+            </w:r>
+          </w:p>
+        </w:tc>
+        <w:tc>
+          <w:tcPr/>
+          <w:p>
+            <w:pPr>
+              <w:pStyle w:val="Compact"/>
+              <w:jc w:val="left"/>
+            </w:pPr>
+            <w:r>
+              <w:t xml:space="preserve">binary</w:t>
+            </w:r>
+          </w:p>
+        </w:tc>
+      </w:tr>
+      <w:tr>
+        <w:tc>
+          <w:tcPr/>
+          <w:p>
+            <w:pPr>
+              <w:pStyle w:val="Compact"/>
+              <w:jc w:val="left"/>
+            </w:pPr>
+            <w:r>
+              <w:t xml:space="preserve">ReviewsPerMonth</w:t>
+            </w:r>
+          </w:p>
+        </w:tc>
+        <w:tc>
+          <w:tcPr/>
+          <w:p>
+            <w:pPr>
+              <w:pStyle w:val="Compact"/>
+              <w:jc w:val="left"/>
+            </w:pPr>
+            <w:r>
+              <w:t xml:space="preserve">float</w:t>
+            </w:r>
+          </w:p>
+        </w:tc>
+        <w:tc>
+          <w:tcPr/>
+          <w:p>
+            <w:pPr>
+              <w:pStyle w:val="Compact"/>
+              <w:jc w:val="left"/>
+            </w:pPr>
+            <w:r>
+              <w:t xml:space="preserve">q2_price_q25</w:t>
+            </w:r>
+          </w:p>
+        </w:tc>
+        <w:tc>
+          <w:tcPr/>
+          <w:p>
+            <w:pPr>
+              <w:pStyle w:val="Compact"/>
+              <w:jc w:val="left"/>
+            </w:pPr>
+            <w:r>
+              <w:t xml:space="preserve">float</w:t>
+            </w:r>
+          </w:p>
+        </w:tc>
+        <w:tc>
+          <w:tcPr/>
+          <w:p>
+            <w:pPr>
+              <w:pStyle w:val="Compact"/>
+              <w:jc w:val="left"/>
+            </w:pPr>
+            <w:r>
+              <w:t xml:space="preserve">q2_booked_m5</w:t>
+            </w:r>
+          </w:p>
+        </w:tc>
+        <w:tc>
+          <w:tcPr/>
+          <w:p>
+            <w:pPr>
+              <w:pStyle w:val="Compact"/>
+              <w:jc w:val="left"/>
+            </w:pPr>
+            <w:r>
+              <w:t xml:space="preserve">binary</w:t>
+            </w:r>
+          </w:p>
+        </w:tc>
+      </w:tr>
+      <w:tr>
+        <w:tc>
+          <w:tcPr/>
+          <w:p>
+            <w:pPr>
+              <w:pStyle w:val="Compact"/>
+              <w:jc w:val="left"/>
+            </w:pPr>
+            <w:r>
+              <w:t xml:space="preserve">PricePerGuest</w:t>
+            </w:r>
+          </w:p>
+        </w:tc>
+        <w:tc>
+          <w:tcPr/>
+          <w:p>
+            <w:pPr>
+              <w:pStyle w:val="Compact"/>
+              <w:jc w:val="left"/>
+            </w:pPr>
+            <w:r>
+              <w:t xml:space="preserve">float</w:t>
+            </w:r>
+          </w:p>
+        </w:tc>
+        <w:tc>
+          <w:tcPr/>
+          <w:p>
+            <w:pPr>
+              <w:pStyle w:val="Compact"/>
+              <w:jc w:val="left"/>
+            </w:pPr>
+            <w:r>
+              <w:t xml:space="preserve">q2_price_q75</w:t>
+            </w:r>
+          </w:p>
+        </w:tc>
+        <w:tc>
+          <w:tcPr/>
+          <w:p>
+            <w:pPr>
+              <w:pStyle w:val="Compact"/>
+              <w:jc w:val="left"/>
+            </w:pPr>
+            <w:r>
+              <w:t xml:space="preserve">float</w:t>
+            </w:r>
+          </w:p>
+        </w:tc>
+        <w:tc>
+          <w:tcPr/>
+          <w:p>
+            <w:pPr>
+              <w:pStyle w:val="Compact"/>
+              <w:jc w:val="left"/>
+            </w:pPr>
+            <w:r>
+              <w:t xml:space="preserve">q2_booked_m6</w:t>
+            </w:r>
+          </w:p>
+        </w:tc>
+        <w:tc>
+          <w:tcPr/>
+          <w:p>
+            <w:pPr>
+              <w:pStyle w:val="Compact"/>
+              <w:jc w:val="left"/>
+            </w:pPr>
+            <w:r>
+              <w:t xml:space="preserve">binary</w:t>
+            </w:r>
+          </w:p>
+        </w:tc>
+      </w:tr>
+      <w:tr>
+        <w:tc>
+          <w:tcPr/>
+          <w:p>
+            <w:pPr>
+              <w:pStyle w:val="Compact"/>
+              <w:jc w:val="left"/>
+            </w:pPr>
+            <w:r>
+              <w:t xml:space="preserve">WeeklyDiscount</w:t>
+            </w:r>
+          </w:p>
+        </w:tc>
+        <w:tc>
+          <w:tcPr/>
+          <w:p>
+            <w:pPr>
+              <w:pStyle w:val="Compact"/>
+              <w:jc w:val="left"/>
+            </w:pPr>
+            <w:r>
+              <w:t xml:space="preserve">float</w:t>
+            </w:r>
+          </w:p>
+        </w:tc>
+        <w:tc>
+          <w:tcPr/>
+          <w:p>
+            <w:pPr>
+              <w:pStyle w:val="Compact"/>
+              <w:jc w:val="left"/>
+            </w:pPr>
+            <w:r>
+              <w:t xml:space="preserve">q2_booking_rate</w:t>
+            </w:r>
+          </w:p>
+        </w:tc>
+        <w:tc>
+          <w:tcPr/>
+          <w:p>
+            <w:pPr>
+              <w:pStyle w:val="Compact"/>
+              <w:jc w:val="left"/>
+            </w:pPr>
+            <w:r>
+              <w:t xml:space="preserve">float</w:t>
+            </w:r>
+          </w:p>
+        </w:tc>
+        <w:tc>
+          <w:tcPr/>
+          <w:p>
+            <w:pPr>
+              <w:pStyle w:val="Compact"/>
+              <w:jc w:val="left"/>
+            </w:pPr>
+            <w:r>
+              <w:t xml:space="preserve">q1_status_changes</w:t>
+            </w:r>
+          </w:p>
+        </w:tc>
+        <w:tc>
+          <w:tcPr/>
+          <w:p>
+            <w:pPr>
+              <w:pStyle w:val="Compact"/>
+              <w:jc w:val="left"/>
+            </w:pPr>
+            <w:r>
+              <w:t xml:space="preserve">integer</w:t>
+            </w:r>
+          </w:p>
+        </w:tc>
+      </w:tr>
+      <w:tr>
+        <w:tc>
+          <w:tcPr/>
+          <w:p>
+            <w:pPr>
+              <w:pStyle w:val="Compact"/>
+              <w:jc w:val="left"/>
+            </w:pPr>
+            <w:r>
+              <w:t xml:space="preserve">MonthlyDiscount</w:t>
+            </w:r>
+          </w:p>
+        </w:tc>
+        <w:tc>
+          <w:tcPr/>
+          <w:p>
+            <w:pPr>
+              <w:pStyle w:val="Compact"/>
+              <w:jc w:val="left"/>
+            </w:pPr>
+            <w:r>
+              <w:t xml:space="preserve">float</w:t>
+            </w:r>
+          </w:p>
+        </w:tc>
+        <w:tc>
+          <w:tcPr/>
+          <w:p>
+            <w:pPr>
+              <w:pStyle w:val="Compact"/>
+              <w:jc w:val="left"/>
+            </w:pPr>
+            <w:r>
+              <w:t xml:space="preserve">q2_available_rate</w:t>
+            </w:r>
+          </w:p>
+        </w:tc>
+        <w:tc>
+          <w:tcPr/>
+          <w:p>
+            <w:pPr>
+              <w:pStyle w:val="Compact"/>
+              <w:jc w:val="left"/>
+            </w:pPr>
+            <w:r>
+              <w:t xml:space="preserve">float</w:t>
+            </w:r>
+          </w:p>
+        </w:tc>
+        <w:tc>
+          <w:tcPr/>
+          <w:p>
+            <w:pPr>
+              <w:pStyle w:val="Compact"/>
+              <w:jc w:val="left"/>
+            </w:pPr>
+            <w:r>
+              <w:t xml:space="preserve">q1_new_bookings</w:t>
+            </w:r>
+          </w:p>
+        </w:tc>
+        <w:tc>
+          <w:tcPr/>
+          <w:p>
+            <w:pPr>
+              <w:pStyle w:val="Compact"/>
+              <w:jc w:val="left"/>
+            </w:pPr>
+            <w:r>
+              <w:t xml:space="preserve">integer</w:t>
+            </w:r>
+          </w:p>
+        </w:tc>
+      </w:tr>
+      <w:tr>
+        <w:tc>
+          <w:tcPr/>
+          <w:p>
+            <w:pPr>
+              <w:pStyle w:val="Compact"/>
+              <w:jc w:val="left"/>
+            </w:pPr>
+            <w:r>
+              <w:t xml:space="preserve">BedBathRatio</w:t>
+            </w:r>
+          </w:p>
+        </w:tc>
+        <w:tc>
+          <w:tcPr/>
+          <w:p>
+            <w:pPr>
+              <w:pStyle w:val="Compact"/>
+              <w:jc w:val="left"/>
+            </w:pPr>
+            <w:r>
+              <w:t xml:space="preserve">float</w:t>
+            </w:r>
+          </w:p>
+        </w:tc>
+        <w:tc>
+          <w:tcPr/>
+          <w:p>
+            <w:pPr>
+              <w:pStyle w:val="Compact"/>
+              <w:jc w:val="left"/>
+            </w:pPr>
+            <w:r>
+              <w:t xml:space="preserve">q2_reserved_rate</w:t>
+            </w:r>
+          </w:p>
+        </w:tc>
+        <w:tc>
+          <w:tcPr/>
+          <w:p>
+            <w:pPr>
+              <w:pStyle w:val="Compact"/>
+              <w:jc w:val="left"/>
+            </w:pPr>
+            <w:r>
+              <w:t xml:space="preserve">float</w:t>
+            </w:r>
+          </w:p>
+        </w:tc>
+        <w:tc>
+          <w:tcPr/>
+          <w:p>
+            <w:pPr>
+              <w:pStyle w:val="Compact"/>
+              <w:jc w:val="left"/>
+            </w:pPr>
+            <w:r>
+              <w:t xml:space="preserve">q1_booking_ends</w:t>
+            </w:r>
+          </w:p>
+        </w:tc>
+        <w:tc>
+          <w:tcPr/>
+          <w:p>
+            <w:pPr>
+              <w:pStyle w:val="Compact"/>
+              <w:jc w:val="left"/>
+            </w:pPr>
+            <w:r>
+              <w:t xml:space="preserve">integer</w:t>
+            </w:r>
+          </w:p>
+        </w:tc>
+      </w:tr>
+      <w:tr>
+        <w:tc>
+          <w:tcPr/>
+          <w:p>
+            <w:pPr>
+              <w:pStyle w:val="Compact"/>
+              <w:jc w:val="left"/>
+            </w:pPr>
+            <w:r>
+              <w:t xml:space="preserve">ResponseRate_missing</w:t>
+            </w:r>
+          </w:p>
+        </w:tc>
+        <w:tc>
+          <w:tcPr/>
+          <w:p>
+            <w:pPr>
+              <w:pStyle w:val="Compact"/>
+              <w:jc w:val="left"/>
+            </w:pPr>
+            <w:r>
+              <w:t xml:space="preserve">binary</w:t>
+            </w:r>
+          </w:p>
+        </w:tc>
+        <w:tc>
+          <w:tcPr/>
+          <w:p>
+            <w:pPr>
+              <w:pStyle w:val="Compact"/>
+              <w:jc w:val="left"/>
+            </w:pPr>
+            <w:r>
+              <w:t xml:space="preserve">q2_price_range</w:t>
+            </w:r>
+          </w:p>
+        </w:tc>
+        <w:tc>
+          <w:tcPr/>
+          <w:p>
+            <w:pPr>
+              <w:pStyle w:val="Compact"/>
+              <w:jc w:val="left"/>
+            </w:pPr>
+            <w:r>
+              <w:t xml:space="preserve">float</w:t>
+            </w:r>
+          </w:p>
+        </w:tc>
+        <w:tc>
+          <w:tcPr/>
+          <w:p>
+            <w:pPr>
+              <w:pStyle w:val="Compact"/>
+              <w:jc w:val="left"/>
+            </w:pPr>
+            <w:r>
+              <w:t xml:space="preserve">q2_status_changes</w:t>
+            </w:r>
+          </w:p>
+        </w:tc>
+        <w:tc>
+          <w:tcPr/>
+          <w:p>
+            <w:pPr>
+              <w:pStyle w:val="Compact"/>
+              <w:jc w:val="left"/>
+            </w:pPr>
+            <w:r>
+              <w:t xml:space="preserve">integer</w:t>
+            </w:r>
+          </w:p>
+        </w:tc>
+      </w:tr>
+      <w:tr>
+        <w:tc>
+          <w:tcPr/>
+          <w:p>
+            <w:pPr>
+              <w:pStyle w:val="Compact"/>
+              <w:jc w:val="left"/>
+            </w:pPr>
+            <w:r>
+              <w:t xml:space="preserve">ResponseTimemin_missing</w:t>
+            </w:r>
+          </w:p>
+        </w:tc>
+        <w:tc>
+          <w:tcPr/>
+          <w:p>
+            <w:pPr>
+              <w:pStyle w:val="Compact"/>
+              <w:jc w:val="left"/>
+            </w:pPr>
+            <w:r>
+              <w:t xml:space="preserve">binary</w:t>
+            </w:r>
+          </w:p>
+        </w:tc>
+        <w:tc>
+          <w:tcPr/>
+          <w:p>
+            <w:pPr>
+              <w:pStyle w:val="Compact"/>
+              <w:jc w:val="left"/>
+            </w:pPr>
+            <w:r>
+              <w:t xml:space="preserve">q2_price_cv</w:t>
+            </w:r>
+          </w:p>
+        </w:tc>
+        <w:tc>
+          <w:tcPr/>
+          <w:p>
+            <w:pPr>
+              <w:pStyle w:val="Compact"/>
+              <w:jc w:val="left"/>
+            </w:pPr>
+            <w:r>
+              <w:t xml:space="preserve">float</w:t>
+            </w:r>
+          </w:p>
+        </w:tc>
+        <w:tc>
+          <w:tcPr/>
+          <w:p>
+            <w:pPr>
+              <w:pStyle w:val="Compact"/>
+              <w:jc w:val="left"/>
+            </w:pPr>
+            <w:r>
+              <w:t xml:space="preserve">q2_new_bookings</w:t>
+            </w:r>
+          </w:p>
+        </w:tc>
+        <w:tc>
+          <w:tcPr/>
+          <w:p>
+            <w:pPr>
+              <w:pStyle w:val="Compact"/>
+              <w:jc w:val="left"/>
+            </w:pPr>
+            <w:r>
+              <w:t xml:space="preserve">integer</w:t>
+            </w:r>
+          </w:p>
+        </w:tc>
+      </w:tr>
+      <w:tr>
+        <w:tc>
+          <w:tcPr/>
+          <w:p>
+            <w:pPr>
+              <w:pStyle w:val="Compact"/>
+              <w:jc w:val="left"/>
+            </w:pPr>
+            <w:r>
+              <w:t xml:space="preserve">SecurityDeposit_missing</w:t>
+            </w:r>
+          </w:p>
+        </w:tc>
+        <w:tc>
+          <w:tcPr/>
+          <w:p>
+            <w:pPr>
+              <w:pStyle w:val="Compact"/>
+              <w:jc w:val="left"/>
+            </w:pPr>
+            <w:r>
+              <w:t xml:space="preserve">binary</w:t>
+            </w:r>
+          </w:p>
+        </w:tc>
+        <w:tc>
+          <w:tcPr/>
+          <w:p>
+            <w:pPr>
+              <w:pStyle w:val="Compact"/>
+              <w:jc w:val="left"/>
+            </w:pPr>
+            <w:r>
+              <w:t xml:space="preserve">q2_price_iqr</w:t>
+            </w:r>
+          </w:p>
+        </w:tc>
+        <w:tc>
+          <w:tcPr/>
+          <w:p>
+            <w:pPr>
+              <w:pStyle w:val="Compact"/>
+              <w:jc w:val="left"/>
+            </w:pPr>
+            <w:r>
+              <w:t xml:space="preserve">float</w:t>
+            </w:r>
+          </w:p>
+        </w:tc>
+        <w:tc>
+          <w:tcPr/>
+          <w:p>
+            <w:pPr>
+              <w:pStyle w:val="Compact"/>
+              <w:jc w:val="left"/>
+            </w:pPr>
+            <w:r>
+              <w:t xml:space="preserve">q2_booking_ends</w:t>
+            </w:r>
+          </w:p>
+        </w:tc>
+        <w:tc>
+          <w:tcPr/>
+          <w:p>
+            <w:pPr>
+              <w:pStyle w:val="Compact"/>
+              <w:jc w:val="left"/>
+            </w:pPr>
+            <w:r>
+              <w:t xml:space="preserve">integer</w:t>
+            </w:r>
+          </w:p>
+        </w:tc>
+      </w:tr>
+      <w:tr>
+        <w:tc>
+          <w:tcPr/>
+          <w:p>
+            <w:pPr>
+              <w:pStyle w:val="Compact"/>
+              <w:jc w:val="left"/>
+            </w:pPr>
+            <w:r>
+              <w:t xml:space="preserve">CleaningFee_missing</w:t>
+            </w:r>
+          </w:p>
+        </w:tc>
+        <w:tc>
+          <w:tcPr/>
+          <w:p>
+            <w:pPr>
+              <w:pStyle w:val="Compact"/>
+              <w:jc w:val="left"/>
+            </w:pPr>
+            <w:r>
+              <w:t xml:space="preserve">binary</w:t>
+            </w:r>
+          </w:p>
+        </w:tc>
+        <w:tc>
+          <w:tcPr/>
+          <w:p>
+            <w:pPr>
+              <w:pStyle w:val="Compact"/>
+              <w:jc w:val="left"/>
+            </w:pPr>
+            <w:r>
+              <w:t xml:space="preserve">h1_days_total</w:t>
+            </w:r>
+          </w:p>
+        </w:tc>
+        <w:tc>
+          <w:tcPr/>
+          <w:p>
+            <w:pPr>
+              <w:pStyle w:val="Compact"/>
+              <w:jc w:val="left"/>
+            </w:pPr>
+            <w:r>
+              <w:t xml:space="preserve">integer</w:t>
+            </w:r>
+          </w:p>
+        </w:tc>
+        <w:tc>
+          <w:tcPr/>
+          <w:p>
+            <w:pPr>
+              <w:pStyle w:val="Compact"/>
+              <w:jc w:val="left"/>
+            </w:pPr>
+            <w:r>
+              <w:t xml:space="preserve">h1_status_changes</w:t>
+            </w:r>
+          </w:p>
+        </w:tc>
+        <w:tc>
+          <w:tcPr/>
+          <w:p>
+            <w:pPr>
+              <w:pStyle w:val="Compact"/>
+              <w:jc w:val="left"/>
+            </w:pPr>
+            <w:r>
+              <w:t xml:space="preserve">integer</w:t>
+            </w:r>
+          </w:p>
+        </w:tc>
+      </w:tr>
+      <w:tr>
+        <w:tc>
+          <w:tcPr/>
+          <w:p>
+            <w:pPr>
+              <w:pStyle w:val="Compact"/>
+              <w:jc w:val="left"/>
+            </w:pPr>
+            <w:r>
+              <w:t xml:space="preserve">ExtraPeopleFee_missing</w:t>
+            </w:r>
+          </w:p>
+        </w:tc>
+        <w:tc>
+          <w:tcPr/>
+          <w:p>
+            <w:pPr>
+              <w:pStyle w:val="Compact"/>
+              <w:jc w:val="left"/>
+            </w:pPr>
+            <w:r>
+              <w:t xml:space="preserve">binary</w:t>
+            </w:r>
+          </w:p>
+        </w:tc>
+        <w:tc>
+          <w:tcPr/>
+          <w:p>
+            <w:pPr>
+              <w:pStyle w:val="Compact"/>
+              <w:jc w:val="left"/>
+            </w:pPr>
+            <w:r>
+              <w:t xml:space="preserve">h1_days_A</w:t>
+            </w:r>
+          </w:p>
+        </w:tc>
+        <w:tc>
+          <w:tcPr/>
+          <w:p>
+            <w:pPr>
+              <w:pStyle w:val="Compact"/>
+              <w:jc w:val="left"/>
+            </w:pPr>
+            <w:r>
+              <w:t xml:space="preserve">binary</w:t>
+            </w:r>
+          </w:p>
+        </w:tc>
+        <w:tc>
+          <w:tcPr/>
+          <w:p>
+            <w:pPr>
+              <w:pStyle w:val="Compact"/>
+              <w:jc w:val="left"/>
+            </w:pPr>
+            <w:r>
+              <w:t xml:space="preserve">h1_new_bookings</w:t>
+            </w:r>
+          </w:p>
+        </w:tc>
+        <w:tc>
+          <w:tcPr/>
+          <w:p>
+            <w:pPr>
+              <w:pStyle w:val="Compact"/>
+              <w:jc w:val="left"/>
+            </w:pPr>
+            <w:r>
+              <w:t xml:space="preserve">integer</w:t>
+            </w:r>
+          </w:p>
+        </w:tc>
+      </w:tr>
+      <w:tr>
+        <w:tc>
+          <w:tcPr/>
+          <w:p>
+            <w:pPr>
+              <w:pStyle w:val="Compact"/>
+              <w:jc w:val="left"/>
+            </w:pPr>
+            <w:r>
+              <w:t xml:space="preserve">OverallRating_missing</w:t>
+            </w:r>
+          </w:p>
+        </w:tc>
+        <w:tc>
+          <w:tcPr/>
+          <w:p>
+            <w:pPr>
+              <w:pStyle w:val="Compact"/>
+              <w:jc w:val="left"/>
+            </w:pPr>
+            <w:r>
+              <w:t xml:space="preserve">binary</w:t>
+            </w:r>
+          </w:p>
+        </w:tc>
+        <w:tc>
+          <w:tcPr/>
+          <w:p>
+            <w:pPr>
+              <w:pStyle w:val="Compact"/>
+              <w:jc w:val="left"/>
+            </w:pPr>
+            <w:r>
+              <w:t xml:space="preserve">h1_days_B</w:t>
+            </w:r>
+          </w:p>
+        </w:tc>
+        <w:tc>
+          <w:tcPr/>
+          <w:p>
+            <w:pPr>
+              <w:pStyle w:val="Compact"/>
+              <w:jc w:val="left"/>
+            </w:pPr>
+            <w:r>
+              <w:t xml:space="preserve">binary</w:t>
+            </w:r>
+          </w:p>
+        </w:tc>
+        <w:tc>
+          <w:tcPr/>
+          <w:p>
+            <w:pPr>
+              <w:pStyle w:val="Compact"/>
+              <w:jc w:val="left"/>
+            </w:pPr>
+            <w:r>
+              <w:t xml:space="preserve">h1_booking_ends</w:t>
+            </w:r>
+          </w:p>
+        </w:tc>
+        <w:tc>
+          <w:tcPr/>
+          <w:p>
+            <w:pPr>
+              <w:pStyle w:val="Compact"/>
+              <w:jc w:val="left"/>
+            </w:pPr>
+            <w:r>
+              <w:t xml:space="preserve">integer</w:t>
+            </w:r>
+          </w:p>
+        </w:tc>
+      </w:tr>
+      <w:tr>
+        <w:tc>
+          <w:tcPr/>
+          <w:p>
+            <w:pPr>
+              <w:pStyle w:val="Compact"/>
+              <w:jc w:val="left"/>
+            </w:pPr>
+            <w:r>
+              <w:t xml:space="preserve">HasReviews</w:t>
+            </w:r>
+          </w:p>
+        </w:tc>
+        <w:tc>
+          <w:tcPr/>
+          <w:p>
+            <w:pPr>
+              <w:pStyle w:val="Compact"/>
+              <w:jc w:val="left"/>
+            </w:pPr>
+            <w:r>
+              <w:t xml:space="preserve">binary</w:t>
+            </w:r>
+          </w:p>
+        </w:tc>
+        <w:tc>
+          <w:tcPr/>
+          <w:p>
+            <w:pPr>
+              <w:pStyle w:val="Compact"/>
+              <w:jc w:val="left"/>
+            </w:pPr>
+            <w:r>
+              <w:t xml:space="preserve">h1_days_R</w:t>
+            </w:r>
+          </w:p>
+        </w:tc>
+        <w:tc>
+          <w:tcPr/>
+          <w:p>
+            <w:pPr>
+              <w:pStyle w:val="Compact"/>
+              <w:jc w:val="left"/>
+            </w:pPr>
+            <w:r>
+              <w:t xml:space="preserve">binary</w:t>
+            </w:r>
+          </w:p>
+        </w:tc>
+        <w:tc>
+          <w:tcPr/>
+          <w:p>
+            <w:pPr>
+              <w:pStyle w:val="Compact"/>
+              <w:jc w:val="left"/>
+            </w:pPr>
+            <w:r>
+              <w:t xml:space="preserve">recent_days</w:t>
+            </w:r>
+          </w:p>
+        </w:tc>
+        <w:tc>
+          <w:tcPr/>
+          <w:p>
+            <w:pPr>
+              <w:pStyle w:val="Compact"/>
+              <w:jc w:val="left"/>
+            </w:pPr>
+            <w:r>
+              <w:t xml:space="preserve">float</w:t>
+            </w:r>
+          </w:p>
+        </w:tc>
+      </w:tr>
+      <w:tr>
+        <w:tc>
+          <w:tcPr/>
+          <w:p>
+            <w:pPr>
+              <w:pStyle w:val="Compact"/>
+              <w:jc w:val="left"/>
+            </w:pPr>
+            <w:r>
+              <w:t xml:space="preserve">kw_luxury</w:t>
+            </w:r>
+          </w:p>
+        </w:tc>
+        <w:tc>
+          <w:tcPr/>
+          <w:p>
+            <w:pPr>
+              <w:pStyle w:val="Compact"/>
+              <w:jc w:val="left"/>
+            </w:pPr>
+            <w:r>
+              <w:t xml:space="preserve">binary</w:t>
+            </w:r>
+          </w:p>
+        </w:tc>
+        <w:tc>
+          <w:tcPr/>
+          <w:p>
+            <w:pPr>
+              <w:pStyle w:val="Compact"/>
+              <w:jc w:val="left"/>
+            </w:pPr>
+            <w:r>
+              <w:t xml:space="preserve">h1_unique_reservations</w:t>
+            </w:r>
+          </w:p>
+        </w:tc>
+        <w:tc>
+          <w:tcPr/>
+          <w:p>
+            <w:pPr>
+              <w:pStyle w:val="Compact"/>
+              <w:jc w:val="left"/>
+            </w:pPr>
+            <w:r>
+              <w:t xml:space="preserve">integer</w:t>
+            </w:r>
+          </w:p>
+        </w:tc>
+        <w:tc>
+          <w:tcPr/>
+          <w:p>
+            <w:pPr>
+              <w:pStyle w:val="Compact"/>
+              <w:jc w:val="left"/>
+            </w:pPr>
+            <w:r>
+              <w:t xml:space="preserve">recent_booked</w:t>
+            </w:r>
+          </w:p>
+        </w:tc>
+        <w:tc>
+          <w:tcPr/>
+          <w:p>
+            <w:pPr>
+              <w:pStyle w:val="Compact"/>
+              <w:jc w:val="left"/>
+            </w:pPr>
+            <w:r>
+              <w:t xml:space="preserve">binary</w:t>
+            </w:r>
+          </w:p>
+        </w:tc>
+      </w:tr>
+      <w:tr>
+        <w:tc>
+          <w:tcPr/>
+          <w:p>
+            <w:pPr>
+              <w:pStyle w:val="Compact"/>
+              <w:jc w:val="left"/>
+            </w:pPr>
+            <w:r>
+              <w:t xml:space="preserve">kw_private</w:t>
+            </w:r>
+          </w:p>
+        </w:tc>
+        <w:tc>
+          <w:tcPr/>
+          <w:p>
+            <w:pPr>
+              <w:pStyle w:val="Compact"/>
+              <w:jc w:val="left"/>
+            </w:pPr>
+            <w:r>
+              <w:t xml:space="preserve">binary</w:t>
+            </w:r>
+          </w:p>
+        </w:tc>
+        <w:tc>
+          <w:tcPr/>
+          <w:p>
+            <w:pPr>
+              <w:pStyle w:val="Compact"/>
+              <w:jc w:val="left"/>
+            </w:pPr>
+            <w:r>
+              <w:t xml:space="preserve">h1_price_mean</w:t>
+            </w:r>
+          </w:p>
+        </w:tc>
+        <w:tc>
+          <w:tcPr/>
+          <w:p>
+            <w:pPr>
+              <w:pStyle w:val="Compact"/>
+              <w:jc w:val="left"/>
+            </w:pPr>
+            <w:r>
+              <w:t xml:space="preserve">float</w:t>
+            </w:r>
+          </w:p>
+        </w:tc>
+        <w:tc>
+          <w:tcPr/>
+          <w:p>
+            <w:pPr>
+              <w:pStyle w:val="Compact"/>
+              <w:jc w:val="left"/>
+            </w:pPr>
+            <w:r>
+              <w:t xml:space="preserve">recent_available</w:t>
+            </w:r>
+          </w:p>
+        </w:tc>
+        <w:tc>
+          <w:tcPr/>
+          <w:p>
+            <w:pPr>
+              <w:pStyle w:val="Compact"/>
+              <w:jc w:val="left"/>
+            </w:pPr>
+            <w:r>
+              <w:t xml:space="preserve">float</w:t>
+            </w:r>
+          </w:p>
+        </w:tc>
+      </w:tr>
+      <w:tr>
+        <w:tc>
+          <w:tcPr/>
+          <w:p>
+            <w:pPr>
+              <w:pStyle w:val="Compact"/>
+              <w:jc w:val="left"/>
+            </w:pPr>
+            <w:r>
+              <w:t xml:space="preserve">kw_near</w:t>
+            </w:r>
+          </w:p>
+        </w:tc>
+        <w:tc>
+          <w:tcPr/>
+          <w:p>
+            <w:pPr>
+              <w:pStyle w:val="Compact"/>
+              <w:jc w:val="left"/>
+            </w:pPr>
+            <w:r>
+              <w:t xml:space="preserve">binary</w:t>
+            </w:r>
+          </w:p>
+        </w:tc>
+        <w:tc>
+          <w:tcPr/>
+          <w:p>
+            <w:pPr>
+              <w:pStyle w:val="Compact"/>
+              <w:jc w:val="left"/>
+            </w:pPr>
+            <w:r>
+              <w:t xml:space="preserve">h1_price_median</w:t>
+            </w:r>
+          </w:p>
+        </w:tc>
+        <w:tc>
+          <w:tcPr/>
+          <w:p>
+            <w:pPr>
+              <w:pStyle w:val="Compact"/>
+              <w:jc w:val="left"/>
+            </w:pPr>
+            <w:r>
+              <w:t xml:space="preserve">float</w:t>
+            </w:r>
+          </w:p>
+        </w:tc>
+        <w:tc>
+          <w:tcPr/>
+          <w:p>
+            <w:pPr>
+              <w:pStyle w:val="Compact"/>
+              <w:jc w:val="left"/>
+            </w:pPr>
+            <w:r>
+              <w:t xml:space="preserve">recent_price_mean</w:t>
+            </w:r>
+          </w:p>
+        </w:tc>
+        <w:tc>
+          <w:tcPr/>
+          <w:p>
+            <w:pPr>
+              <w:pStyle w:val="Compact"/>
+              <w:jc w:val="left"/>
+            </w:pPr>
+            <w:r>
+              <w:t xml:space="preserve">float</w:t>
+            </w:r>
+          </w:p>
+        </w:tc>
+      </w:tr>
+      <w:tr>
+        <w:tc>
+          <w:tcPr/>
+          <w:p>
+            <w:pPr>
+              <w:pStyle w:val="Compact"/>
+              <w:jc w:val="left"/>
+            </w:pPr>
+            <w:r>
+              <w:t xml:space="preserve">kw_cozy</w:t>
+            </w:r>
+          </w:p>
+        </w:tc>
+        <w:tc>
+          <w:tcPr/>
+          <w:p>
+            <w:pPr>
+              <w:pStyle w:val="Compact"/>
+              <w:jc w:val="left"/>
+            </w:pPr>
+            <w:r>
+              <w:t xml:space="preserve">binary</w:t>
+            </w:r>
+          </w:p>
+        </w:tc>
+        <w:tc>
+          <w:tcPr/>
+          <w:p>
+            <w:pPr>
+              <w:pStyle w:val="Compact"/>
+              <w:jc w:val="left"/>
+            </w:pPr>
+            <w:r>
+              <w:t xml:space="preserve">h1_price_std</w:t>
+            </w:r>
+          </w:p>
+        </w:tc>
+        <w:tc>
+          <w:tcPr/>
+          <w:p>
+            <w:pPr>
+              <w:pStyle w:val="Compact"/>
+              <w:jc w:val="left"/>
+            </w:pPr>
+            <w:r>
+              <w:t xml:space="preserve">float</w:t>
+            </w:r>
+          </w:p>
+        </w:tc>
+        <w:tc>
+          <w:tcPr/>
+          <w:p>
+            <w:pPr>
+              <w:pStyle w:val="Compact"/>
+              <w:jc w:val="left"/>
+            </w:pPr>
+            <w:r>
+              <w:t xml:space="preserve">recent_price_std</w:t>
+            </w:r>
+          </w:p>
+        </w:tc>
+        <w:tc>
+          <w:tcPr/>
+          <w:p>
+            <w:pPr>
+              <w:pStyle w:val="Compact"/>
+              <w:jc w:val="left"/>
+            </w:pPr>
+            <w:r>
+              <w:t xml:space="preserve">float</w:t>
+            </w:r>
+          </w:p>
+        </w:tc>
+      </w:tr>
+      <w:tr>
+        <w:tc>
+          <w:tcPr/>
+          <w:p>
+            <w:pPr>
+              <w:pStyle w:val="Compact"/>
+              <w:jc w:val="left"/>
+            </w:pPr>
+            <w:r>
+              <w:t xml:space="preserve">kw_view</w:t>
+            </w:r>
+          </w:p>
+        </w:tc>
+        <w:tc>
+          <w:tcPr/>
+          <w:p>
+            <w:pPr>
+              <w:pStyle w:val="Compact"/>
+              <w:jc w:val="left"/>
+            </w:pPr>
+            <w:r>
+              <w:t xml:space="preserve">binary</w:t>
+            </w:r>
+          </w:p>
+        </w:tc>
+        <w:tc>
+          <w:tcPr/>
+          <w:p>
+            <w:pPr>
+              <w:pStyle w:val="Compact"/>
+              <w:jc w:val="left"/>
+            </w:pPr>
+            <w:r>
+              <w:t xml:space="preserve">h1_price_nunique</w:t>
+            </w:r>
+          </w:p>
+        </w:tc>
+        <w:tc>
+          <w:tcPr/>
+          <w:p>
+            <w:pPr>
+              <w:pStyle w:val="Compact"/>
+              <w:jc w:val="left"/>
+            </w:pPr>
+            <w:r>
+              <w:t xml:space="preserve">integer</w:t>
+            </w:r>
+          </w:p>
+        </w:tc>
+        <w:tc>
+          <w:tcPr/>
+          <w:p>
+            <w:pPr>
+              <w:pStyle w:val="Compact"/>
+              <w:jc w:val="left"/>
+            </w:pPr>
+            <w:r>
+              <w:t xml:space="preserve">recent_booking_rate</w:t>
+            </w:r>
+          </w:p>
+        </w:tc>
+        <w:tc>
+          <w:tcPr/>
+          <w:p>
+            <w:pPr>
+              <w:pStyle w:val="Compact"/>
+              <w:jc w:val="left"/>
+            </w:pPr>
+            <w:r>
+              <w:t xml:space="preserve">float</w:t>
+            </w:r>
+          </w:p>
+        </w:tc>
+      </w:tr>
+      <w:tr>
+        <w:tc>
+          <w:tcPr/>
+          <w:p>
+            <w:pPr>
+              <w:pStyle w:val="Compact"/>
+              <w:jc w:val="left"/>
+            </w:pPr>
+            <w:r>
+              <w:t xml:space="preserve">kw_modern</w:t>
+            </w:r>
+          </w:p>
+        </w:tc>
+        <w:tc>
+          <w:tcPr/>
+          <w:p>
+            <w:pPr>
+              <w:pStyle w:val="Compact"/>
+              <w:jc w:val="left"/>
+            </w:pPr>
+            <w:r>
+              <w:t xml:space="preserve">binary</w:t>
+            </w:r>
+          </w:p>
+        </w:tc>
+        <w:tc>
+          <w:tcPr/>
+          <w:p>
+            <w:pPr>
+              <w:pStyle w:val="Compact"/>
+              <w:jc w:val="left"/>
+            </w:pPr>
+            <w:r>
+              <w:t xml:space="preserve">h1_price_min</w:t>
+            </w:r>
+          </w:p>
+        </w:tc>
+        <w:tc>
+          <w:tcPr/>
+          <w:p>
+            <w:pPr>
+              <w:pStyle w:val="Compact"/>
+              <w:jc w:val="left"/>
+            </w:pPr>
+            <w:r>
+              <w:t xml:space="preserve">float</w:t>
+            </w:r>
+          </w:p>
+        </w:tc>
+        <w:tc>
+          <w:tcPr/>
+          <w:p>
+            <w:pPr>
+              <w:pStyle w:val="Compact"/>
+              <w:jc w:val="left"/>
+            </w:pPr>
+            <w:r>
+              <w:t xml:space="preserve">recent_available_rate</w:t>
+            </w:r>
+          </w:p>
+        </w:tc>
+        <w:tc>
+          <w:tcPr/>
+          <w:p>
+            <w:pPr>
+              <w:pStyle w:val="Compact"/>
+              <w:jc w:val="left"/>
+            </w:pPr>
+            <w:r>
+              <w:t xml:space="preserve">float</w:t>
+            </w:r>
+          </w:p>
+        </w:tc>
+      </w:tr>
+      <w:tr>
+        <w:tc>
+          <w:tcPr/>
+          <w:p>
+            <w:pPr>
+              <w:pStyle w:val="Compact"/>
+              <w:jc w:val="left"/>
+            </w:pPr>
+            <w:r>
+              <w:t xml:space="preserve">title_len</w:t>
+            </w:r>
+          </w:p>
+        </w:tc>
+        <w:tc>
+          <w:tcPr/>
+          <w:p>
+            <w:pPr>
+              <w:pStyle w:val="Compact"/>
+              <w:jc w:val="left"/>
+            </w:pPr>
+            <w:r>
+              <w:t xml:space="preserve">integer</w:t>
+            </w:r>
+          </w:p>
+        </w:tc>
+        <w:tc>
+          <w:tcPr/>
+          <w:p>
+            <w:pPr>
+              <w:pStyle w:val="Compact"/>
+              <w:jc w:val="left"/>
+            </w:pPr>
+            <w:r>
+              <w:t xml:space="preserve">h1_price_max</w:t>
+            </w:r>
+          </w:p>
+        </w:tc>
+        <w:tc>
+          <w:tcPr/>
+          <w:p>
+            <w:pPr>
+              <w:pStyle w:val="Compact"/>
+              <w:jc w:val="left"/>
+            </w:pPr>
+            <w:r>
+              <w:t xml:space="preserve">float</w:t>
+            </w:r>
+          </w:p>
+        </w:tc>
+        <w:tc>
+          <w:tcPr/>
+          <w:p>
+            <w:pPr>
+              <w:pStyle w:val="Compact"/>
+              <w:jc w:val="left"/>
+            </w:pPr>
+            <w:r>
+              <w:t xml:space="preserve">price_change_q2_q1</w:t>
+            </w:r>
+          </w:p>
+        </w:tc>
+        <w:tc>
+          <w:tcPr/>
+          <w:p>
+            <w:pPr>
+              <w:pStyle w:val="Compact"/>
+              <w:jc w:val="left"/>
+            </w:pPr>
+            <w:r>
+              <w:t xml:space="preserve">float</w:t>
+            </w:r>
+          </w:p>
+        </w:tc>
+      </w:tr>
+      <w:tr>
+        <w:tc>
+          <w:tcPr/>
+          <w:p>
+            <w:pPr>
+              <w:pStyle w:val="Compact"/>
+              <w:jc w:val="left"/>
+            </w:pPr>
+            <w:r>
+              <w:t xml:space="preserve">title_words</w:t>
+            </w:r>
+          </w:p>
+        </w:tc>
+        <w:tc>
+          <w:tcPr/>
+          <w:p>
+            <w:pPr>
+              <w:pStyle w:val="Compact"/>
+              <w:jc w:val="left"/>
+            </w:pPr>
+            <w:r>
+              <w:t xml:space="preserve">integer</w:t>
+            </w:r>
+          </w:p>
+        </w:tc>
+        <w:tc>
+          <w:tcPr/>
+          <w:p>
+            <w:pPr>
+              <w:pStyle w:val="Compact"/>
+              <w:jc w:val="left"/>
+            </w:pPr>
+            <w:r>
+              <w:t xml:space="preserve">h1_price_q25</w:t>
+            </w:r>
+          </w:p>
+        </w:tc>
+        <w:tc>
+          <w:tcPr/>
+          <w:p>
+            <w:pPr>
+              <w:pStyle w:val="Compact"/>
+              <w:jc w:val="left"/>
+            </w:pPr>
+            <w:r>
+              <w:t xml:space="preserve">float</w:t>
+            </w:r>
+          </w:p>
+        </w:tc>
+        <w:tc>
+          <w:tcPr/>
+          <w:p>
+            <w:pPr>
+              <w:pStyle w:val="Compact"/>
+              <w:jc w:val="left"/>
+            </w:pPr>
+            <w:r>
+              <w:t xml:space="preserve">booking_rate_change_q2_q1</w:t>
+            </w:r>
+          </w:p>
+        </w:tc>
+        <w:tc>
+          <w:tcPr/>
+          <w:p>
+            <w:pPr>
+              <w:pStyle w:val="Compact"/>
+              <w:jc w:val="left"/>
+            </w:pPr>
+            <w:r>
+              <w:t xml:space="preserve">float</w:t>
+            </w:r>
+          </w:p>
+        </w:tc>
+      </w:tr>
+      <w:tr>
+        <w:tc>
+          <w:tcPr/>
+          <w:p>
+            <w:pPr>
+              <w:pStyle w:val="Compact"/>
+              <w:jc w:val="left"/>
+            </w:pPr>
+            <w:r>
+              <w:t xml:space="preserve">geo_cluster</w:t>
+            </w:r>
+          </w:p>
+        </w:tc>
+        <w:tc>
+          <w:tcPr/>
+          <w:p>
+            <w:pPr>
+              <w:pStyle w:val="Compact"/>
+              <w:jc w:val="left"/>
+            </w:pPr>
+            <w:r>
+              <w:t xml:space="preserve">str</w:t>
+            </w:r>
+          </w:p>
+        </w:tc>
+        <w:tc>
+          <w:tcPr/>
+          <w:p>
+            <w:pPr>
+              <w:pStyle w:val="Compact"/>
+              <w:jc w:val="left"/>
+            </w:pPr>
+            <w:r>
+              <w:t xml:space="preserve">h1_price_q75</w:t>
+            </w:r>
+          </w:p>
+        </w:tc>
+        <w:tc>
+          <w:tcPr/>
+          <w:p>
+            <w:pPr>
+              <w:pStyle w:val="Compact"/>
+              <w:jc w:val="left"/>
+            </w:pPr>
+            <w:r>
+              <w:t xml:space="preserve">float</w:t>
+            </w:r>
+          </w:p>
+        </w:tc>
+        <w:tc>
+          <w:tcPr/>
+          <w:p>
+            <w:pPr>
+              <w:pStyle w:val="Compact"/>
+            </w:pPr>
+          </w:p>
+        </w:tc>
+        <w:tc>
+          <w:tcPr/>
+          <w:p>
+            <w:pPr>
+              <w:pStyle w:val="Compact"/>
+            </w:pPr>
+          </w:p>
+        </w:tc>
+      </w:tr>
+      <w:tr>
+        <w:tc>
+          <w:tcPr/>
+          <w:p>
+            <w:pPr>
+              <w:pStyle w:val="Compact"/>
+              <w:jc w:val="left"/>
+            </w:pPr>
+            <w:r>
+              <w:t xml:space="preserve">q1_days_total</w:t>
+            </w:r>
+          </w:p>
+        </w:tc>
+        <w:tc>
+          <w:tcPr/>
+          <w:p>
+            <w:pPr>
+              <w:pStyle w:val="Compact"/>
+              <w:jc w:val="left"/>
+            </w:pPr>
+            <w:r>
+              <w:t xml:space="preserve">integer</w:t>
+            </w:r>
+          </w:p>
+        </w:tc>
+        <w:tc>
+          <w:tcPr/>
+          <w:p>
+            <w:pPr>
+              <w:pStyle w:val="Compact"/>
+              <w:jc w:val="left"/>
+            </w:pPr>
+            <w:r>
+              <w:t xml:space="preserve">h1_booking_rate</w:t>
+            </w:r>
+          </w:p>
+        </w:tc>
+        <w:tc>
+          <w:tcPr/>
+          <w:p>
+            <w:pPr>
+              <w:pStyle w:val="Compact"/>
+              <w:jc w:val="left"/>
+            </w:pPr>
+            <w:r>
+              <w:t xml:space="preserve">float</w:t>
+            </w:r>
+          </w:p>
+        </w:tc>
+        <w:tc>
+          <w:tcPr/>
+          <w:p>
+            <w:pPr>
+              <w:pStyle w:val="Compact"/>
+            </w:pPr>
+          </w:p>
+        </w:tc>
+        <w:tc>
+          <w:tcPr/>
+          <w:p>
+            <w:pPr>
+              <w:pStyle w:val="Compact"/>
+            </w:pPr>
+          </w:p>
+        </w:tc>
+      </w:tr>
+    </w:tbl>
+    <w:bookmarkStart w:id="135" w:name="refs"/>
+    <w:bookmarkStart w:id="98" w:name="ref-adamiak2018"/>
     <w:p>
       <w:pPr>
         <w:pStyle w:val="Bibliography"/>
@@ -23019,7 +27124,7 @@
       <w:r>
         <w:t xml:space="preserve"> </w:t>
       </w:r>
-      <w:hyperlink r:id="rId96">
+      <w:hyperlink r:id="rId97">
         <w:r>
           <w:rPr>
             <w:rStyle w:val="Hyperlink"/>
@@ -23031,8 +27136,8 @@
         <w:t xml:space="preserve">.</w:t>
       </w:r>
     </w:p>
-    <w:bookmarkEnd w:id="97"/>
-    <w:bookmarkStart w:id="99" w:name="ref-gunter2018"/>
+    <w:bookmarkEnd w:id="98"/>
+    <w:bookmarkStart w:id="100" w:name="ref-gunter2018"/>
     <w:p>
       <w:pPr>
         <w:pStyle w:val="Bibliography"/>
@@ -23095,7 +27200,7 @@
       <w:r>
         <w:t xml:space="preserve"> </w:t>
       </w:r>
-      <w:hyperlink r:id="rId98">
+      <w:hyperlink r:id="rId99">
         <w:r>
           <w:rPr>
             <w:rStyle w:val="Hyperlink"/>
@@ -23107,8 +27212,8 @@
         <w:t xml:space="preserve">.</w:t>
       </w:r>
     </w:p>
-    <w:bookmarkEnd w:id="99"/>
-    <w:bookmarkStart w:id="101" w:name="ref-wang2017"/>
+    <w:bookmarkEnd w:id="100"/>
+    <w:bookmarkStart w:id="102" w:name="ref-wang2017"/>
     <w:p>
       <w:pPr>
         <w:pStyle w:val="Bibliography"/>
@@ -23156,7 +27261,7 @@
       <w:r>
         <w:t xml:space="preserve"> </w:t>
       </w:r>
-      <w:hyperlink r:id="rId100">
+      <w:hyperlink r:id="rId101">
         <w:r>
           <w:rPr>
             <w:rStyle w:val="Hyperlink"/>
@@ -23168,8 +27273,8 @@
         <w:t xml:space="preserve">.</w:t>
       </w:r>
     </w:p>
-    <w:bookmarkEnd w:id="101"/>
-    <w:bookmarkStart w:id="103" w:name="ref-tang2024"/>
+    <w:bookmarkEnd w:id="102"/>
+    <w:bookmarkStart w:id="104" w:name="ref-tang2024"/>
     <w:p>
       <w:pPr>
         <w:pStyle w:val="Bibliography"/>
@@ -23220,7 +27325,7 @@
       <w:r>
         <w:t xml:space="preserve"> </w:t>
       </w:r>
-      <w:hyperlink r:id="rId102">
+      <w:hyperlink r:id="rId103">
         <w:r>
           <w:rPr>
             <w:rStyle w:val="Hyperlink"/>
@@ -23232,8 +27337,8 @@
         <w:t xml:space="preserve">.</w:t>
       </w:r>
     </w:p>
-    <w:bookmarkEnd w:id="103"/>
-    <w:bookmarkStart w:id="105" w:name="ref-camatti2024"/>
+    <w:bookmarkEnd w:id="104"/>
+    <w:bookmarkStart w:id="106" w:name="ref-camatti2024"/>
     <w:p>
       <w:pPr>
         <w:pStyle w:val="Bibliography"/>
@@ -23284,7 +27389,7 @@
       <w:r>
         <w:t xml:space="preserve"> </w:t>
       </w:r>
-      <w:hyperlink r:id="rId104">
+      <w:hyperlink r:id="rId105">
         <w:r>
           <w:rPr>
             <w:rStyle w:val="Hyperlink"/>
@@ -23296,8 +27401,8 @@
         <w:t xml:space="preserve">.</w:t>
       </w:r>
     </w:p>
-    <w:bookmarkEnd w:id="105"/>
-    <w:bookmarkStart w:id="106" w:name="ref-kalehbasti2019"/>
+    <w:bookmarkEnd w:id="106"/>
+    <w:bookmarkStart w:id="107" w:name="ref-kalehbasti2019"/>
     <w:p>
       <w:pPr>
         <w:pStyle w:val="Bibliography"/>
@@ -23343,8 +27448,8 @@
         <w:t xml:space="preserve">, 2019.</w:t>
       </w:r>
     </w:p>
-    <w:bookmarkEnd w:id="106"/>
-    <w:bookmarkStart w:id="107" w:name="ref-k353comp"/>
+    <w:bookmarkEnd w:id="107"/>
+    <w:bookmarkStart w:id="108" w:name="ref-k353comp"/>
     <w:p>
       <w:pPr>
         <w:pStyle w:val="Bibliography"/>
@@ -23395,8 +27500,8 @@
         <w:t xml:space="preserve">Kaggle, 2026.</w:t>
       </w:r>
     </w:p>
-    <w:bookmarkEnd w:id="107"/>
-    <w:bookmarkStart w:id="108" w:name="ref-siker2018"/>
+    <w:bookmarkEnd w:id="108"/>
+    <w:bookmarkStart w:id="109" w:name="ref-siker2018"/>
     <w:p>
       <w:pPr>
         <w:pStyle w:val="Bibliography"/>
@@ -23438,8 +27543,8 @@
         <w:t xml:space="preserve">Technical Report, 2018.</w:t>
       </w:r>
     </w:p>
-    <w:bookmarkEnd w:id="108"/>
-    <w:bookmarkStart w:id="109" w:name="ref-chapman2023"/>
+    <w:bookmarkEnd w:id="109"/>
+    <w:bookmarkStart w:id="110" w:name="ref-chapman2023"/>
     <w:p>
       <w:pPr>
         <w:pStyle w:val="Bibliography"/>
@@ -23476,8 +27581,8 @@
         <w:t xml:space="preserve">, 2023.</w:t>
       </w:r>
     </w:p>
-    <w:bookmarkEnd w:id="109"/>
-    <w:bookmarkStart w:id="111" w:name="ref-islam2022"/>
+    <w:bookmarkEnd w:id="110"/>
+    <w:bookmarkStart w:id="112" w:name="ref-islam2022"/>
     <w:p>
       <w:pPr>
         <w:pStyle w:val="Bibliography"/>
@@ -23549,7 +27654,7 @@
       <w:r>
         <w:t xml:space="preserve"> </w:t>
       </w:r>
-      <w:hyperlink r:id="rId110">
+      <w:hyperlink r:id="rId111">
         <w:r>
           <w:rPr>
             <w:rStyle w:val="Hyperlink"/>
@@ -23561,8 +27666,8 @@
         <w:t xml:space="preserve">.</w:t>
       </w:r>
     </w:p>
-    <w:bookmarkEnd w:id="111"/>
-    <w:bookmarkStart w:id="113" w:name="ref-tobin1958"/>
+    <w:bookmarkEnd w:id="112"/>
+    <w:bookmarkStart w:id="114" w:name="ref-tobin1958"/>
     <w:p>
       <w:pPr>
         <w:pStyle w:val="Bibliography"/>
@@ -23601,7 +27706,7 @@
       <w:r>
         <w:t xml:space="preserve"> </w:t>
       </w:r>
-      <w:hyperlink r:id="rId112">
+      <w:hyperlink r:id="rId113">
         <w:r>
           <w:rPr>
             <w:rStyle w:val="Hyperlink"/>
@@ -23613,8 +27718,8 @@
         <w:t xml:space="preserve">.</w:t>
       </w:r>
     </w:p>
-    <w:bookmarkEnd w:id="113"/>
-    <w:bookmarkStart w:id="115" w:name="ref-quinlan1986"/>
+    <w:bookmarkEnd w:id="114"/>
+    <w:bookmarkStart w:id="116" w:name="ref-quinlan1986"/>
     <w:p>
       <w:pPr>
         <w:pStyle w:val="Bibliography"/>
@@ -23653,7 +27758,7 @@
       <w:r>
         <w:t xml:space="preserve"> </w:t>
       </w:r>
-      <w:hyperlink r:id="rId114">
+      <w:hyperlink r:id="rId115">
         <w:r>
           <w:rPr>
             <w:rStyle w:val="Hyperlink"/>
@@ -23665,8 +27770,8 @@
         <w:t xml:space="preserve">.</w:t>
       </w:r>
     </w:p>
-    <w:bookmarkEnd w:id="115"/>
-    <w:bookmarkStart w:id="117" w:name="ref-breiman1996"/>
+    <w:bookmarkEnd w:id="116"/>
+    <w:bookmarkStart w:id="118" w:name="ref-breiman1996"/>
     <w:p>
       <w:pPr>
         <w:pStyle w:val="Bibliography"/>
@@ -23705,7 +27810,7 @@
       <w:r>
         <w:t xml:space="preserve"> </w:t>
       </w:r>
-      <w:hyperlink r:id="rId116">
+      <w:hyperlink r:id="rId117">
         <w:r>
           <w:rPr>
             <w:rStyle w:val="Hyperlink"/>
@@ -23717,8 +27822,8 @@
         <w:t xml:space="preserve">.</w:t>
       </w:r>
     </w:p>
-    <w:bookmarkEnd w:id="117"/>
-    <w:bookmarkStart w:id="119" w:name="ref-breiman2001"/>
+    <w:bookmarkEnd w:id="118"/>
+    <w:bookmarkStart w:id="120" w:name="ref-breiman2001"/>
     <w:p>
       <w:pPr>
         <w:pStyle w:val="Bibliography"/>
@@ -23757,7 +27862,7 @@
       <w:r>
         <w:t xml:space="preserve"> </w:t>
       </w:r>
-      <w:hyperlink r:id="rId118">
+      <w:hyperlink r:id="rId119">
         <w:r>
           <w:rPr>
             <w:rStyle w:val="Hyperlink"/>
@@ -23769,8 +27874,8 @@
         <w:t xml:space="preserve">.</w:t>
       </w:r>
     </w:p>
-    <w:bookmarkEnd w:id="119"/>
-    <w:bookmarkStart w:id="121" w:name="ref-friedman2001"/>
+    <w:bookmarkEnd w:id="120"/>
+    <w:bookmarkStart w:id="122" w:name="ref-friedman2001"/>
     <w:p>
       <w:pPr>
         <w:pStyle w:val="Bibliography"/>
@@ -23809,7 +27914,7 @@
       <w:r>
         <w:t xml:space="preserve"> </w:t>
       </w:r>
-      <w:hyperlink r:id="rId120">
+      <w:hyperlink r:id="rId121">
         <w:r>
           <w:rPr>
             <w:rStyle w:val="Hyperlink"/>
@@ -23821,8 +27926,8 @@
         <w:t xml:space="preserve">.</w:t>
       </w:r>
     </w:p>
-    <w:bookmarkEnd w:id="121"/>
-    <w:bookmarkStart w:id="123" w:name="ref-chen2016xgboost"/>
+    <w:bookmarkEnd w:id="122"/>
+    <w:bookmarkStart w:id="124" w:name="ref-chen2016xgboost"/>
     <w:p>
       <w:pPr>
         <w:pStyle w:val="Bibliography"/>
@@ -23873,7 +27978,7 @@
       <w:r>
         <w:t xml:space="preserve"> </w:t>
       </w:r>
-      <w:hyperlink r:id="rId122">
+      <w:hyperlink r:id="rId123">
         <w:r>
           <w:rPr>
             <w:rStyle w:val="Hyperlink"/>
@@ -23885,8 +27990,8 @@
         <w:t xml:space="preserve">.</w:t>
       </w:r>
     </w:p>
-    <w:bookmarkEnd w:id="123"/>
-    <w:bookmarkStart w:id="125" w:name="ref-hastie2009esl"/>
+    <w:bookmarkEnd w:id="124"/>
+    <w:bookmarkStart w:id="126" w:name="ref-hastie2009esl"/>
     <w:p>
       <w:pPr>
         <w:pStyle w:val="Bibliography"/>
@@ -23919,7 +28024,7 @@
       <w:r>
         <w:t xml:space="preserve"> </w:t>
       </w:r>
-      <w:hyperlink r:id="rId124">
+      <w:hyperlink r:id="rId125">
         <w:r>
           <w:rPr>
             <w:rStyle w:val="Hyperlink"/>
@@ -23931,8 +28036,8 @@
         <w:t xml:space="preserve">.</w:t>
       </w:r>
     </w:p>
-    <w:bookmarkEnd w:id="125"/>
-    <w:bookmarkStart w:id="126" w:name="ref-pedregosa2011sklearn"/>
+    <w:bookmarkEnd w:id="126"/>
+    <w:bookmarkStart w:id="127" w:name="ref-pedregosa2011sklearn"/>
     <w:p>
       <w:pPr>
         <w:pStyle w:val="Bibliography"/>
@@ -23991,8 +28096,8 @@
         <w:t xml:space="preserve">, vol. 12, pp. 2825–2830, 2011.</w:t>
       </w:r>
     </w:p>
-    <w:bookmarkEnd w:id="126"/>
-    <w:bookmarkStart w:id="127" w:name="ref-bergstra2012random"/>
+    <w:bookmarkEnd w:id="127"/>
+    <w:bookmarkStart w:id="128" w:name="ref-bergstra2012random"/>
     <w:p>
       <w:pPr>
         <w:pStyle w:val="Bibliography"/>
@@ -24029,8 +28134,8 @@
         <w:t xml:space="preserve">, vol. 13, pp. 281–305, 2012.</w:t>
       </w:r>
     </w:p>
-    <w:bookmarkEnd w:id="127"/>
-    <w:bookmarkStart w:id="129" w:name="ref-dietterich1998"/>
+    <w:bookmarkEnd w:id="128"/>
+    <w:bookmarkStart w:id="130" w:name="ref-dietterich1998"/>
     <w:p>
       <w:pPr>
         <w:pStyle w:val="Bibliography"/>
@@ -24069,7 +28174,7 @@
       <w:r>
         <w:t xml:space="preserve"> </w:t>
       </w:r>
-      <w:hyperlink r:id="rId128">
+      <w:hyperlink r:id="rId129">
         <w:r>
           <w:rPr>
             <w:rStyle w:val="Hyperlink"/>
@@ -24081,8 +28186,8 @@
         <w:t xml:space="preserve">.</w:t>
       </w:r>
     </w:p>
-    <w:bookmarkEnd w:id="129"/>
-    <w:bookmarkStart w:id="131" w:name="ref-wolpert1992stacked"/>
+    <w:bookmarkEnd w:id="130"/>
+    <w:bookmarkStart w:id="132" w:name="ref-wolpert1992stacked"/>
     <w:p>
       <w:pPr>
         <w:pStyle w:val="Bibliography"/>
@@ -24121,7 +28226,7 @@
       <w:r>
         <w:t xml:space="preserve"> </w:t>
       </w:r>
-      <w:hyperlink r:id="rId130">
+      <w:hyperlink r:id="rId131">
         <w:r>
           <w:rPr>
             <w:rStyle w:val="Hyperlink"/>
@@ -24133,8 +28238,8 @@
         <w:t xml:space="preserve">.</w:t>
       </w:r>
     </w:p>
-    <w:bookmarkEnd w:id="131"/>
-    <w:bookmarkStart w:id="132" w:name="ref-paszke2019pytorch"/>
+    <w:bookmarkEnd w:id="132"/>
+    <w:bookmarkStart w:id="133" w:name="ref-paszke2019pytorch"/>
     <w:p>
       <w:pPr>
         <w:pStyle w:val="Bibliography"/>
@@ -24196,8 +28301,8 @@
         <w:t xml:space="preserve">, 2019, pp. 8024–8035.</w:t>
       </w:r>
     </w:p>
-    <w:bookmarkEnd w:id="132"/>
-    <w:bookmarkStart w:id="133" w:name="ref-kingma2015adam"/>
+    <w:bookmarkEnd w:id="133"/>
+    <w:bookmarkStart w:id="134" w:name="ref-kingma2015adam"/>
     <w:p>
       <w:pPr>
         <w:pStyle w:val="Bibliography"/>
@@ -24246,9 +28351,9 @@
         <w:t xml:space="preserve">, 2015.</w:t>
       </w:r>
     </w:p>
-    <w:bookmarkEnd w:id="133"/>
     <w:bookmarkEnd w:id="134"/>
     <w:bookmarkEnd w:id="135"/>
+    <w:bookmarkEnd w:id="136"/>
     <w:sectPr>
       <w:footnotePr>
         <w:numRestart w:val="eachSect"/>

</xml_diff>

<commit_message>
Refactor feature engineering and model evaluation in project paper
- Updated the feature count from across multiple sections in both the main and journal versions of the paper.
- Enhanced the description of the model comparison process, emphasizing the inclusion of LightGBM and CatBoost as non-course comparison models.
- Clarified the methodology for blending models, specifying the use of SLSQP for optimization and detailing the weights assigned to each model.
- Revised sections to improve clarity and accuracy regarding the computational cost and experimental setup.
- Adjusted the scope statement to reflect the inclusion of additional models in the analysis while maintaining the integrity of the graded submission.
</commit_message>
<xml_diff>
--- a/paper/Final_Project_Paper_Bakir_Baskal_IEEE.docx
+++ b/paper/Final_Project_Paper_Bakir_Baskal_IEEE.docx
@@ -303,7 +303,7 @@
           <w:i/>
           <w:sz w:val="18"/>
         </w:rPr>
-        <w:t xml:space="preserve">million rows), we engineered a flat matrix of 150 features per property</w:t>
+        <w:t xml:space="preserve">million rows), we engineered a flat matrix of 149 features per property</w:t>
       </w:r>
       <w:r>
         <w:rPr>
@@ -975,31 +975,66 @@
         <w:t xml:space="preserve"> </w:t>
       </w:r>
       <w:r>
-        <w:t xml:space="preserve">competition scores submissions purely by Mean Squared Error. The whole project</w:t>
-      </w:r>
-      <w:r>
-        <w:t xml:space="preserve"> </w:t>
-      </w:r>
-      <w:r>
-        <w:t xml:space="preserve">was constrained in one important way: every model and optimization algorithm we</w:t>
-      </w:r>
-      <w:r>
-        <w:t xml:space="preserve"> </w:t>
-      </w:r>
-      <w:r>
-        <w:t xml:space="preserve">use has to come from the COMP468 course modules, so deliberately popular Kaggle</w:t>
-      </w:r>
-      <w:r>
-        <w:t xml:space="preserve"> </w:t>
-      </w:r>
-      <w:r>
-        <w:t xml:space="preserve">tools such as CatBoost or LightGBM were off the table for us and we did not use</w:t>
-      </w:r>
-      <w:r>
-        <w:t xml:space="preserve"> </w:t>
-      </w:r>
-      <w:r>
-        <w:t xml:space="preserve">them.</w:t>
+        <w:t xml:space="preserve">competition scores submissions purely by Mean Squared Error. The graded Kaggle</w:t>
+      </w:r>
+      <w:r>
+        <w:t xml:space="preserve"> </w:t>
+      </w:r>
+      <w:r>
+        <w:t xml:space="preserve">entry itself was constrained in one important way: every model and optimization</w:t>
+      </w:r>
+      <w:r>
+        <w:t xml:space="preserve"> </w:t>
+      </w:r>
+      <w:r>
+        <w:t xml:space="preserve">algorithm used for that submission had to come from the COMP468 course modules,</w:t>
+      </w:r>
+      <w:r>
+        <w:t xml:space="preserve"> </w:t>
+      </w:r>
+      <w:r>
+        <w:t xml:space="preserve">so deliberately popular Kaggle tools such as CatBoost or LightGBM were off the</w:t>
+      </w:r>
+      <w:r>
+        <w:t xml:space="preserve"> </w:t>
+      </w:r>
+      <w:r>
+        <w:t xml:space="preserve">table for the entry we submitted. This report’s later revision, addressing</w:t>
+      </w:r>
+      <w:r>
+        <w:t xml:space="preserve"> </w:t>
+      </w:r>
+      <w:r>
+        <w:t xml:space="preserve">peer-review feedback, additionally evaluates LightGBM and CatBoost as</w:t>
+      </w:r>
+      <w:r>
+        <w:t xml:space="preserve"> </w:t>
+      </w:r>
+      <w:r>
+        <w:t xml:space="preserve">non-course comparison models and blend members (Section </w:t>
+      </w:r>
+      <w:hyperlink w:anchor="sec:blend">
+        <w:r>
+          <w:rPr>
+            <w:rStyle w:val="Hyperlink"/>
+          </w:rPr>
+          <w:t xml:space="preserve">4.6</w:t>
+        </w:r>
+      </w:hyperlink>
+      <w:r>
+        <w:t xml:space="preserve">); their</w:t>
+      </w:r>
+      <w:r>
+        <w:t xml:space="preserve"> </w:t>
+      </w:r>
+      <w:r>
+        <w:t xml:space="preserve">results are reported throughout the paper but were not part of the graded</w:t>
+      </w:r>
+      <w:r>
+        <w:t xml:space="preserve"> </w:t>
+      </w:r>
+      <w:r>
+        <w:t xml:space="preserve">Kaggle submission.</w:t>
       </w:r>
     </w:p>
     <w:p>
@@ -1592,7 +1627,7 @@
         <w:t xml:space="preserve"> </w:t>
       </w:r>
       <w:r>
-        <w:t xml:space="preserve">of our effort in the 150-feature matrix and treated the model comparison as a</w:t>
+        <w:t xml:space="preserve">of our effort in the 149-feature matrix and treated the model comparison as a</w:t>
       </w:r>
       <w:r>
         <w:t xml:space="preserve"> </w:t>
@@ -4890,7 +4925,7 @@
         <w:t xml:space="preserve">PropertyID</w:t>
       </w:r>
       <w:r>
-        <w:t xml:space="preserve">. We ended up with 150 features (144</w:t>
+        <w:t xml:space="preserve">. We ended up with 149 features (143</w:t>
       </w:r>
       <w:r>
         <w:t xml:space="preserve"> </w:t>
@@ -5328,7 +5363,7 @@
         <w:jc w:val="both"/>
       </w:pPr>
       <w:r>
-        <w:t xml:space="preserve">In total this produced 150 features, of which 143 are numeric and 6 are</w:t>
+        <w:t xml:space="preserve">In total this produced 149 features, of which 143 are numeric and 6 are</w:t>
       </w:r>
       <w:r>
         <w:t xml:space="preserve"> </w:t>
@@ -5407,7 +5442,7 @@
         <w:rPr>
           <w:sz w:val="16"/>
         </w:rPr>
-        <w:t xml:space="preserve">Engineered feature families (150 features total: 143 numeric,</w:t>
+        <w:t xml:space="preserve">Engineered feature families (149 features total: 143 numeric,</w:t>
       </w:r>
       <w:r>
         <w:rPr>
@@ -5427,7 +5462,7 @@
         <w:tblStyle w:val="Table"/>
         <w:tblW w:type="auto" w:w="0"/>
         <w:tblLook w:firstRow="1" w:lastRow="0" w:firstColumn="0" w:lastColumn="0" w:noHBand="0" w:noVBand="0" w:val="0020"/>
-        <w:tblCaption w:val="Engineered feature families (150 features total: 143 numeric, 6 categorical)."/>
+        <w:tblCaption w:val="Engineered feature families (149 features total: 143 numeric, 6 categorical)."/>
       </w:tblPr>
       <w:tblGrid>
         <w:gridCol w:w="3960"/>
@@ -7000,24 +7035,7 @@
         <w:t xml:space="preserve"> </w:t>
       </w:r>
       <w:r>
-        <w:t xml:space="preserve">is</w:t>
-      </w:r>
-      <w:r>
-        <w:t xml:space="preserve"> </w:t>
-      </w:r>
-      <w:hyperlink w:anchor="eq:smooth">
-        <w:r>
-          <w:rPr>
-            <w:rStyle w:val="Hyperlink"/>
-          </w:rPr>
-          <w:t xml:space="preserve">[eq:smooth]</w:t>
-        </w:r>
-      </w:hyperlink>
-      <w:r>
-        <w:t xml:space="preserve"> </w:t>
-      </w:r>
-      <w:r>
-        <w:t xml:space="preserve">evaluated on</w:t>
+        <w:t xml:space="preserve">is the smoothing formula above evaluated on</w:t>
       </w:r>
       <w:r>
         <w:t xml:space="preserve"> </w:t>
@@ -7128,24 +7146,7 @@
         <w:jc w:val="both"/>
       </w:pPr>
       <w:r>
-        <w:t xml:space="preserve">To make</w:t>
-      </w:r>
-      <w:r>
-        <w:t xml:space="preserve"> </w:t>
-      </w:r>
-      <w:hyperlink w:anchor="eq:smooth">
-        <w:r>
-          <w:rPr>
-            <w:rStyle w:val="Hyperlink"/>
-          </w:rPr>
-          <w:t xml:space="preserve">[eq:smooth]</w:t>
-        </w:r>
-      </w:hyperlink>
-      <w:r>
-        <w:t xml:space="preserve"> </w:t>
-      </w:r>
-      <w:r>
-        <w:t xml:space="preserve">concrete, consider a neighbourhood that appears in</w:t>
+        <w:t xml:space="preserve">To make the smoothing formula concrete, consider a neighbourhood that appears in</w:t>
       </w:r>
       <w:r>
         <w:t xml:space="preserve"> </w:t>
@@ -10309,19 +10310,8 @@
       <w:r>
         <w:t xml:space="preserve"> </w:t>
       </w:r>
-      <w:hyperlink w:anchor="eq:bn">
-        <w:r>
-          <w:rPr>
-            <w:rStyle w:val="Hyperlink"/>
-          </w:rPr>
-          <w:t xml:space="preserve">[eq:bn]</w:t>
-        </w:r>
-      </w:hyperlink>
-      <w:r>
-        <w:t xml:space="preserve"> </w:t>
-      </w:r>
-      <w:r>
-        <w:t xml:space="preserve">keeps the pre-activations well scaled across the three hidden</w:t>
+      <w:r>
+        <w:t xml:space="preserve">(defined above) keeps the pre-activations well scaled across the three hidden</w:t>
       </w:r>
       <w:r>
         <w:t xml:space="preserve"> </w:t>
@@ -10367,30 +10357,19 @@
         <w:t xml:space="preserve"> </w:t>
       </w:r>
       <w:r>
-        <w:t xml:space="preserve">weight decay in</w:t>
-      </w:r>
-      <w:r>
-        <w:t xml:space="preserve"> </w:t>
-      </w:r>
-      <w:hyperlink w:anchor="eq:adam">
-        <w:r>
-          <w:rPr>
-            <w:rStyle w:val="Hyperlink"/>
-          </w:rPr>
-          <w:t xml:space="preserve">[eq:adam]</w:t>
-        </w:r>
-      </w:hyperlink>
-      <w:r>
-        <w:t xml:space="preserve"> </w:t>
-      </w:r>
-      <w:r>
-        <w:t xml:space="preserve">regularize a network that would otherwise overfit a 19</w:t>
+        <w:t xml:space="preserve">weight decay in the Adam update</w:t>
+      </w:r>
+      <w:r>
+        <w:t xml:space="preserve"> </w:t>
+      </w:r>
+      <w:r>
+        <w:t xml:space="preserve">above regularize a network that would otherwise overfit a 19</w:t>
       </w:r>
       <w:r>
         <w:t xml:space="preserve">,</w:t>
       </w:r>
       <w:r>
-        <w:t xml:space="preserve">497-row table with 150</w:t>
+        <w:t xml:space="preserve">497-row table with 149</w:t>
       </w:r>
       <w:r>
         <w:t xml:space="preserve"> </w:t>
@@ -12734,21 +12713,7 @@
         <w:t xml:space="preserve"> </w:t>
       </w:r>
       <w:r>
-        <w:t xml:space="preserve">by</w:t>
-      </w:r>
-      <w:r>
-        <w:t xml:space="preserve"> </w:t>
-      </w:r>
-      <w:hyperlink w:anchor="eq:earlystop">
-        <w:r>
-          <w:rPr>
-            <w:rStyle w:val="Hyperlink"/>
-          </w:rPr>
-          <w:t xml:space="preserve">[eq:earlystop]</w:t>
-        </w:r>
-      </w:hyperlink>
-      <w:r>
-        <w:t xml:space="preserve">, and record</w:t>
+        <w:t xml:space="preserve">by the early-stopping rule above, and record</w:t>
       </w:r>
       <w:r>
         <w:t xml:space="preserve"> </w:t>
@@ -14198,41 +14163,13 @@
         <w:jc w:val="both"/>
       </w:pPr>
       <w:r>
-        <w:t xml:space="preserve">The equality constraint </w:t>
-      </w:r>
-      <w:hyperlink w:anchor="eq:blendeq">
-        <w:r>
-          <w:rPr>
-            <w:rStyle w:val="Hyperlink"/>
-          </w:rPr>
-          <w:t xml:space="preserve">[eq:blendeq]</w:t>
-        </w:r>
-      </w:hyperlink>
-      <w:r>
-        <w:t xml:space="preserve"> </w:t>
-      </w:r>
-      <w:r>
-        <w:t xml:space="preserve">and the box</w:t>
-      </w:r>
-      <w:r>
-        <w:t xml:space="preserve"> </w:t>
-      </w:r>
-      <w:r>
-        <w:t xml:space="preserve">bounds </w:t>
-      </w:r>
-      <w:hyperlink w:anchor="eq:blendbox">
-        <w:r>
-          <w:rPr>
-            <w:rStyle w:val="Hyperlink"/>
-          </w:rPr>
-          <w:t xml:space="preserve">[eq:blendbox]</w:t>
-        </w:r>
-      </w:hyperlink>
-      <w:r>
-        <w:t xml:space="preserve"> </w:t>
-      </w:r>
-      <w:r>
-        <w:t xml:space="preserve">make the solution a</w:t>
+        <w:t xml:space="preserve">The equality constraint above and the box</w:t>
+      </w:r>
+      <w:r>
+        <w:t xml:space="preserve"> </w:t>
+      </w:r>
+      <w:r>
+        <w:t xml:space="preserve">bounds above make the solution a</w:t>
       </w:r>
       <w:r>
         <w:t xml:space="preserve"> </w:t>
@@ -14257,30 +14194,8 @@
         <w:t xml:space="preserve"> </w:t>
       </w:r>
       <w:r>
-        <w:t xml:space="preserve">from receiving a runaway weight. We solve</w:t>
-      </w:r>
-      <w:r>
-        <w:t xml:space="preserve"> </w:t>
-      </w:r>
-      <w:hyperlink w:anchor="eq:blendobj">
-        <w:r>
-          <w:rPr>
-            <w:rStyle w:val="Hyperlink"/>
-          </w:rPr>
-          <w:t xml:space="preserve">[eq:blendobj]</w:t>
-        </w:r>
-      </w:hyperlink>
-      <w:r>
-        <w:t xml:space="preserve">–</w:t>
-      </w:r>
-      <w:hyperlink w:anchor="eq:blendbox">
-        <w:r>
-          <w:rPr>
-            <w:rStyle w:val="Hyperlink"/>
-          </w:rPr>
-          <w:t xml:space="preserve">[eq:blendbox]</w:t>
-        </w:r>
-      </w:hyperlink>
+        <w:t xml:space="preserve">from receiving a runaway weight. We solve this constrained problem</w:t>
+      </w:r>
       <w:r>
         <w:t xml:space="preserve"> </w:t>
       </w:r>
@@ -14448,19 +14363,8 @@
       <w:r>
         <w:t xml:space="preserve"> </w:t>
       </w:r>
-      <w:hyperlink w:anchor="eq:blendeq">
-        <w:r>
-          <w:rPr>
-            <w:rStyle w:val="Hyperlink"/>
-          </w:rPr>
-          <w:t xml:space="preserve">[eq:blendeq]</w:t>
-        </w:r>
-      </w:hyperlink>
-      <w:r>
-        <w:t xml:space="preserve"> </w:t>
-      </w:r>
-      <w:r>
-        <w:t xml:space="preserve">still holds exactly. We also ran a randomized search over the</w:t>
+      <w:r>
+        <w:t xml:space="preserve">the weights still sum to one exactly. We also ran a randomized search over the</w:t>
       </w:r>
       <w:r>
         <w:t xml:space="preserve"> </w:t>
@@ -14484,7 +14388,7 @@
         <w:t xml:space="preserve"> </w:t>
       </w:r>
       <w:r>
-        <w:t xml:space="preserve">concentrated most of the weight on XGBoost (</w:t>
+        <w:t xml:space="preserve">concentrated the largest share of weight on XGBoost (</w:t>
       </w:r>
       <m:oMath>
         <m:r>
@@ -14494,17 +14398,17 @@
           <m:t>≈</m:t>
         </m:r>
         <m:r>
-          <m:t>0.73</m:t>
+          <m:t>0.34</m:t>
         </m:r>
       </m:oMath>
       <w:r>
-        <w:t xml:space="preserve">) and gave smaller,</w:t>
-      </w:r>
-      <w:r>
-        <w:t xml:space="preserve"> </w:t>
-      </w:r>
-      <w:r>
-        <w:t xml:space="preserve">non-zero weights to the MLP (</w:t>
+        <w:t xml:space="preserve">), with</w:t>
+      </w:r>
+      <w:r>
+        <w:t xml:space="preserve"> </w:t>
+      </w:r>
+      <w:r>
+        <w:t xml:space="preserve">substantial secondary weight on XGBoost v3 (</w:t>
       </w:r>
       <m:oMath>
         <m:r>
@@ -14514,11 +14418,17 @@
           <m:t>≈</m:t>
         </m:r>
         <m:r>
-          <m:t>0.14</m:t>
+          <m:t>0.26</m:t>
         </m:r>
       </m:oMath>
       <w:r>
-        <w:t xml:space="preserve">), Linear Regression (</w:t>
+        <w:t xml:space="preserve">) and LightGBM</w:t>
+      </w:r>
+      <w:r>
+        <w:t xml:space="preserve"> </w:t>
+      </w:r>
+      <w:r>
+        <w:t xml:space="preserve">(</w:t>
       </w:r>
       <m:oMath>
         <m:r>
@@ -14528,17 +14438,11 @@
           <m:t>≈</m:t>
         </m:r>
         <m:r>
-          <m:t>0.10</m:t>
+          <m:t>0.20</m:t>
         </m:r>
       </m:oMath>
       <w:r>
-        <w:t xml:space="preserve">),</w:t>
-      </w:r>
-      <w:r>
-        <w:t xml:space="preserve"> </w:t>
-      </w:r>
-      <w:r>
-        <w:t xml:space="preserve">and Random Forest (</w:t>
+        <w:t xml:space="preserve">), a smaller contribution from the MLP (</w:t>
       </w:r>
       <m:oMath>
         <m:r>
@@ -14548,11 +14452,51 @@
           <m:t>≈</m:t>
         </m:r>
         <m:r>
+          <m:t>0.11</m:t>
+        </m:r>
+      </m:oMath>
+      <w:r>
+        <w:t xml:space="preserve">), modest</w:t>
+      </w:r>
+      <w:r>
+        <w:t xml:space="preserve"> </w:t>
+      </w:r>
+      <w:r>
+        <w:t xml:space="preserve">weight on Linear Regression (</w:t>
+      </w:r>
+      <m:oMath>
+        <m:r>
+          <m:rPr>
+            <m:sty m:val="p"/>
+          </m:rPr>
+          <m:t>≈</m:t>
+        </m:r>
+        <m:r>
+          <m:t>0.06</m:t>
+        </m:r>
+      </m:oMath>
+      <w:r>
+        <w:t xml:space="preserve">) and CatBoost (</w:t>
+      </w:r>
+      <m:oMath>
+        <m:r>
+          <m:rPr>
+            <m:sty m:val="p"/>
+          </m:rPr>
+          <m:t>≈</m:t>
+        </m:r>
+        <m:r>
           <m:t>0.03</m:t>
         </m:r>
       </m:oMath>
       <w:r>
-        <w:t xml:space="preserve">), while Gradient Boosting was dropped to zero</w:t>
+        <w:t xml:space="preserve">), while</w:t>
+      </w:r>
+      <w:r>
+        <w:t xml:space="preserve"> </w:t>
+      </w:r>
+      <w:r>
+        <w:t xml:space="preserve">Random Forest and Gradient Boosting were both dropped to zero</w:t>
       </w:r>
       <w:r>
         <w:t xml:space="preserve"> </w:t>
@@ -15466,16 +15410,8 @@
       <w:r>
         <w:t xml:space="preserve"> </w:t>
       </w:r>
-      <w:hyperlink w:anchor="eq:kfoldte">
-        <w:r>
-          <w:rPr>
-            <w:rStyle w:val="Hyperlink"/>
-          </w:rPr>
-          <w:t xml:space="preserve">[eq:kfoldte]</w:t>
-        </w:r>
-      </w:hyperlink>
-      <w:r>
-        <w:t xml:space="preserve">. As a last step we clip predictions to</w:t>
+      <w:r>
+        <w:t xml:space="preserve">the target-encoding formula above. As a last step we clip predictions to</w:t>
       </w:r>
       <w:r>
         <w:t xml:space="preserve"> </w:t>
@@ -15555,7 +15491,7 @@
         <w:t xml:space="preserve"> </w:t>
       </w:r>
       <w:r>
-        <w:t xml:space="preserve">kept an eye on cost throughout. Building the 150-feature matrix from the eight</w:t>
+        <w:t xml:space="preserve">kept an eye on cost throughout. Building the 149-feature matrix from the eight</w:t>
       </w:r>
       <w:r>
         <w:t xml:space="preserve"> </w:t>
@@ -16792,35 +16728,7 @@
         <w:t xml:space="preserve"> </w:t>
       </w:r>
       <w:r>
-        <w:t xml:space="preserve">stopping</w:t>
-      </w:r>
-      <w:r>
-        <w:t xml:space="preserve"> </w:t>
-      </w:r>
-      <w:hyperlink w:anchor="eq:xgbobj">
-        <w:r>
-          <w:rPr>
-            <w:rStyle w:val="Hyperlink"/>
-          </w:rPr>
-          <w:t xml:space="preserve">[eq:xgbobj]</w:t>
-        </w:r>
-      </w:hyperlink>
-      <w:r>
-        <w:t xml:space="preserve">–</w:t>
-      </w:r>
-      <w:hyperlink w:anchor="eq:earlystop">
-        <w:r>
-          <w:rPr>
-            <w:rStyle w:val="Hyperlink"/>
-          </w:rPr>
-          <w:t xml:space="preserve">[eq:earlystop]</w:t>
-        </w:r>
-      </w:hyperlink>
-      <w:r>
-        <w:t xml:space="preserve"> </w:t>
-      </w:r>
-      <w:r>
-        <w:t xml:space="preserve">that keep the corresponding</w:t>
+        <w:t xml:space="preserve">stopping (the regularized objective and early-stopping rule above) that keep the corresponding</w:t>
       </w:r>
       <w:r>
         <w:t xml:space="preserve"> </w:t>
@@ -17253,28 +17161,14 @@
         <w:rPr>
           <w:sz w:val="16"/>
         </w:rPr>
-        <w:t xml:space="preserve">(problem </w:t>
-      </w:r>
-      <w:hyperlink w:anchor="eq:blendobj">
+        <w:t xml:space="preserve">(the constrained blend problem in Section </w:t>
+      </w:r>
+      <w:hyperlink w:anchor="sec:blend">
         <w:r>
           <w:rPr>
             <w:rStyle w:val="Hyperlink"/>
           </w:rPr>
-          <w:t xml:space="preserve">[eq:blendobj]</w:t>
-        </w:r>
-      </w:hyperlink>
-      <w:r>
-        <w:rPr>
-          <w:sz w:val="16"/>
-        </w:rPr>
-        <w:t xml:space="preserve">–</w:t>
-      </w:r>
-      <w:hyperlink w:anchor="eq:blendbox">
-        <w:r>
-          <w:rPr>
-            <w:rStyle w:val="Hyperlink"/>
-          </w:rPr>
-          <w:t xml:space="preserve">[eq:blendbox]</w:t>
+          <w:t xml:space="preserve">4.6</w:t>
         </w:r>
       </w:hyperlink>
       <w:r>
@@ -17289,7 +17183,7 @@
         <w:tblStyle w:val="Table"/>
         <w:tblW w:type="auto" w:w="0"/>
         <w:tblLook w:firstRow="1" w:lastRow="0" w:firstColumn="0" w:lastColumn="0" w:noHBand="0" w:noVBand="0" w:val="0020"/>
-        <w:tblCaption w:val="Optimal blend weights chosen by SLSQP on the OOF predictions (problem [eq:blendobj]–[eq:blendbox])."/>
+        <w:tblCaption w:val="Optimal blend weights chosen by SLSQP on the OOF predictions (the constrained blend problem in Section 4.6)."/>
       </w:tblPr>
       <w:tblGrid>
         <w:gridCol w:w="3960"/>
@@ -21809,44 +21703,13 @@
         <w:t xml:space="preserve"> </w:t>
       </w:r>
       <w:r>
-        <w:t xml:space="preserve">hyper-parameters, 5-fold CV per</w:t>
-      </w:r>
-      <w:r>
-        <w:t xml:space="preserve"> </w:t>
-      </w:r>
-      <w:hyperlink w:anchor="eq:searchobj">
-        <w:r>
-          <w:rPr>
-            <w:rStyle w:val="Hyperlink"/>
-          </w:rPr>
-          <w:t xml:space="preserve">[eq:searchobj]</w:t>
-        </w:r>
-      </w:hyperlink>
-      <w:r>
-        <w:t xml:space="preserve">—but additionally lets each</w:t>
-      </w:r>
-      <w:r>
-        <w:t xml:space="preserve"> </w:t>
-      </w:r>
-      <w:r>
-        <w:t xml:space="preserve">fold stop at its own best iteration</w:t>
-      </w:r>
-      <w:r>
-        <w:t xml:space="preserve"> </w:t>
-      </w:r>
-      <w:hyperlink w:anchor="eq:earlystop">
-        <w:r>
-          <w:rPr>
-            <w:rStyle w:val="Hyperlink"/>
-          </w:rPr>
-          <w:t xml:space="preserve">[eq:earlystop]</w:t>
-        </w:r>
-      </w:hyperlink>
-      <w:r>
-        <w:t xml:space="preserve"> </w:t>
-      </w:r>
-      <w:r>
-        <w:t xml:space="preserve">and logs every trial to</w:t>
+        <w:t xml:space="preserve">hyper-parameters, 5-fold CV per the search objective defined earlier—but additionally lets each</w:t>
+      </w:r>
+      <w:r>
+        <w:t xml:space="preserve"> </w:t>
+      </w:r>
+      <w:r>
+        <w:t xml:space="preserve">fold stop at its own best iteration using the early-stopping rule defined earlier and logs every trial to</w:t>
       </w:r>
       <w:r>
         <w:t xml:space="preserve"> </w:t>
@@ -21906,28 +21769,14 @@
         <w:t xml:space="preserve"> </w:t>
       </w:r>
       <w:r>
-        <w:t xml:space="preserve">SLSQP-optimised weights per</w:t>
-      </w:r>
-      <w:r>
-        <w:t xml:space="preserve"> </w:t>
-      </w:r>
-      <w:hyperlink w:anchor="eq:blendobj">
+        <w:t xml:space="preserve">SLSQP-optimised weights per the constrained blend problem in Section </w:t>
+      </w:r>
+      <w:hyperlink w:anchor="sec:blend">
         <w:r>
           <w:rPr>
             <w:rStyle w:val="Hyperlink"/>
           </w:rPr>
-          <w:t xml:space="preserve">[eq:blendobj]</w:t>
-        </w:r>
-      </w:hyperlink>
-      <w:r>
-        <w:t xml:space="preserve">–</w:t>
-      </w:r>
-      <w:hyperlink w:anchor="eq:blendbox">
-        <w:r>
-          <w:rPr>
-            <w:rStyle w:val="Hyperlink"/>
-          </w:rPr>
-          <w:t xml:space="preserve">[eq:blendbox]</w:t>
+          <w:t xml:space="preserve">4.6</w:t>
         </w:r>
       </w:hyperlink>
       <w:r>
@@ -22124,49 +21973,78 @@
         <w:t xml:space="preserve"> </w:t>
       </w:r>
       <w:r>
-        <w:t xml:space="preserve">optimizers taught in COMP468. Starting from five raw CSV files we engineered 150</w:t>
-      </w:r>
-      <w:r>
-        <w:t xml:space="preserve"> </w:t>
-      </w:r>
-      <w:r>
-        <w:t xml:space="preserve">per-property features, compared five models with 5-fold cross-validation, retuned</w:t>
-      </w:r>
-      <w:r>
-        <w:t xml:space="preserve"> </w:t>
-      </w:r>
-      <w:r>
-        <w:t xml:space="preserve">XGBoost with a custom early-stopping randomized search, and combined the best</w:t>
-      </w:r>
-      <w:r>
-        <w:t xml:space="preserve"> </w:t>
-      </w:r>
-      <w:r>
-        <w:t xml:space="preserve">models with an SLSQP-optimised weighted blend. The blend scored 185.499 MSE on</w:t>
-      </w:r>
-      <w:r>
-        <w:t xml:space="preserve"> </w:t>
-      </w:r>
-      <w:r>
-        <w:t xml:space="preserve">Kaggle and ranked our team first among the six competing teams, and its</w:t>
-      </w:r>
-      <w:r>
-        <w:t xml:space="preserve"> </w:t>
-      </w:r>
-      <w:r>
-        <w:t xml:space="preserve">leaderboard score matched our internal cross-validation closely, which gives us</w:t>
-      </w:r>
-      <w:r>
-        <w:t xml:space="preserve"> </w:t>
-      </w:r>
-      <w:r>
-        <w:t xml:space="preserve">confidence that the result is real and not an artefact of leaderboard</w:t>
-      </w:r>
-      <w:r>
-        <w:t xml:space="preserve"> </w:t>
-      </w:r>
-      <w:r>
-        <w:t xml:space="preserve">overfitting.</w:t>
+        <w:t xml:space="preserve">optimizers taught in COMP468 for the graded Kaggle submission. Starting from</w:t>
+      </w:r>
+      <w:r>
+        <w:t xml:space="preserve"> </w:t>
+      </w:r>
+      <w:r>
+        <w:t xml:space="preserve">five raw CSV files we engineered 149 per-property features, compared five</w:t>
+      </w:r>
+      <w:r>
+        <w:t xml:space="preserve"> </w:t>
+      </w:r>
+      <w:r>
+        <w:t xml:space="preserve">course models with 5-fold cross-validation, retuned XGBoost with a custom</w:t>
+      </w:r>
+      <w:r>
+        <w:t xml:space="preserve"> </w:t>
+      </w:r>
+      <w:r>
+        <w:t xml:space="preserve">early-stopping randomized search, and combined the best models with an</w:t>
+      </w:r>
+      <w:r>
+        <w:t xml:space="preserve"> </w:t>
+      </w:r>
+      <w:r>
+        <w:t xml:space="preserve">SLSQP-optimised weighted blend; this report’s later revision additionally</w:t>
+      </w:r>
+      <w:r>
+        <w:t xml:space="preserve"> </w:t>
+      </w:r>
+      <w:r>
+        <w:t xml:space="preserve">evaluates LightGBM, CatBoost, and two further XGBoost configurations as</w:t>
+      </w:r>
+      <w:r>
+        <w:t xml:space="preserve"> </w:t>
+      </w:r>
+      <w:r>
+        <w:t xml:space="preserve">non-course comparison and blend members (Section </w:t>
+      </w:r>
+      <w:hyperlink w:anchor="sec:blend">
+        <w:r>
+          <w:rPr>
+            <w:rStyle w:val="Hyperlink"/>
+          </w:rPr>
+          <w:t xml:space="preserve">4.6</w:t>
+        </w:r>
+      </w:hyperlink>
+      <w:r>
+        <w:t xml:space="preserve">). The</w:t>
+      </w:r>
+      <w:r>
+        <w:t xml:space="preserve"> </w:t>
+      </w:r>
+      <w:r>
+        <w:t xml:space="preserve">course-only blend scored 185.499 MSE on Kaggle and ranked our team first among</w:t>
+      </w:r>
+      <w:r>
+        <w:t xml:space="preserve"> </w:t>
+      </w:r>
+      <w:r>
+        <w:t xml:space="preserve">the six competing teams, and its leaderboard score matched our internal</w:t>
+      </w:r>
+      <w:r>
+        <w:t xml:space="preserve"> </w:t>
+      </w:r>
+      <w:r>
+        <w:t xml:space="preserve">cross-validation closely, which gives us confidence that the result is real and</w:t>
+      </w:r>
+      <w:r>
+        <w:t xml:space="preserve"> </w:t>
+      </w:r>
+      <w:r>
+        <w:t xml:space="preserve">not an artefact of leaderboard overfitting.</w:t>
       </w:r>
     </w:p>
     <w:p>
@@ -22857,21 +22735,7 @@
         <w:t xml:space="preserve"> </w:t>
       </w:r>
       <w:r>
-        <w:t xml:space="preserve">same spirit as the additive smoothing already in</w:t>
-      </w:r>
-      <w:r>
-        <w:t xml:space="preserve"> </w:t>
-      </w:r>
-      <w:hyperlink w:anchor="eq:smooth">
-        <w:r>
-          <w:rPr>
-            <w:rStyle w:val="Hyperlink"/>
-          </w:rPr>
-          <w:t xml:space="preserve">[eq:smooth]</w:t>
-        </w:r>
-      </w:hyperlink>
-      <w:r>
-        <w:t xml:space="preserve">. Third, with a</w:t>
+        <w:t xml:space="preserve">same spirit as the additive smoothing formula already used for target encoding. Third, with a</w:t>
       </w:r>
       <w:r>
         <w:t xml:space="preserve"> </w:t>
@@ -23135,37 +22999,31 @@
         <w:t xml:space="preserve"> </w:t>
       </w:r>
       <w:r>
-        <w:t xml:space="preserve">Models used in the submitted solution are</w:t>
-      </w:r>
-      <w:r>
-        <w:t xml:space="preserve"> </w:t>
-      </w:r>
-      <w:r>
-        <w:t xml:space="preserve">restricted to COMP468 course material: Linear Regression, Random Forest, Gradient</w:t>
-      </w:r>
-      <w:r>
-        <w:t xml:space="preserve"> </w:t>
-      </w:r>
-      <w:r>
-        <w:t xml:space="preserve">Boosting, XGBoost, and a PyTorch MLP trained with Adam, combined by a convex</w:t>
-      </w:r>
-      <w:r>
-        <w:t xml:space="preserve"> </w:t>
-      </w:r>
-      <w:r>
-        <w:t xml:space="preserve">weighted blend. No external models (e.g. CatBoost or LightGBM) were used. We did</w:t>
-      </w:r>
-      <w:r>
-        <w:t xml:space="preserve"> </w:t>
-      </w:r>
-      <w:r>
-        <w:t xml:space="preserve">not use Kaggle notebooks or Colab for training; we used GitHub and a local IDE,</w:t>
-      </w:r>
-      <w:r>
-        <w:t xml:space="preserve"> </w:t>
-      </w:r>
-      <w:r>
-        <w:t xml:space="preserve">and uploaded submission</w:t>
+        <w:t xml:space="preserve">Models used in the graded Kaggle submission</w:t>
+      </w:r>
+      <w:r>
+        <w:t xml:space="preserve"> </w:t>
+      </w:r>
+      <w:r>
+        <w:t xml:space="preserve">(the leaderboard score above) are restricted to COMP468 course material: Linear</w:t>
+      </w:r>
+      <w:r>
+        <w:t xml:space="preserve"> </w:t>
+      </w:r>
+      <w:r>
+        <w:t xml:space="preserve">Regression, Random Forest, Gradient Boosting, XGBoost, and a PyTorch MLP</w:t>
+      </w:r>
+      <w:r>
+        <w:t xml:space="preserve"> </w:t>
+      </w:r>
+      <w:r>
+        <w:t xml:space="preserve">trained with Adam, combined by a convex weighted blend; no external models</w:t>
+      </w:r>
+      <w:r>
+        <w:t xml:space="preserve"> </w:t>
+      </w:r>
+      <w:r>
+        <w:t xml:space="preserve">(e.g. CatBoost or LightGBM) were part of that submitted</w:t>
       </w:r>
       <w:r>
         <w:t xml:space="preserve"> </w:t>
@@ -23177,10 +23035,86 @@
         <w:t xml:space="preserve">.csv</w:t>
       </w:r>
       <w:r>
-        <w:t xml:space="preserve"> </w:t>
-      </w:r>
-      <w:r>
-        <w:t xml:space="preserve">files to Kaggle manually.</w:t>
+        <w:t xml:space="preserve">. This</w:t>
+      </w:r>
+      <w:r>
+        <w:t xml:space="preserve"> </w:t>
+      </w:r>
+      <w:r>
+        <w:t xml:space="preserve">report’s later revision additionally evaluates LightGBM, CatBoost, and two</w:t>
+      </w:r>
+      <w:r>
+        <w:t xml:space="preserve"> </w:t>
+      </w:r>
+      <w:r>
+        <w:t xml:space="preserve">further XGBoost configurations as non-course comparison models and blend</w:t>
+      </w:r>
+      <w:r>
+        <w:t xml:space="preserve"> </w:t>
+      </w:r>
+      <w:r>
+        <w:t xml:space="preserve">members (Table </w:t>
+      </w:r>
+      <w:hyperlink w:anchor="tab:weights">
+        <w:r>
+          <w:rPr>
+            <w:rStyle w:val="Hyperlink"/>
+          </w:rPr>
+          <w:t xml:space="preserve">7</w:t>
+        </w:r>
+      </w:hyperlink>
+      <w:r>
+        <w:t xml:space="preserve">, Section </w:t>
+      </w:r>
+      <w:hyperlink w:anchor="sec:blend">
+        <w:r>
+          <w:rPr>
+            <w:rStyle w:val="Hyperlink"/>
+          </w:rPr>
+          <w:t xml:space="preserve">4.6</w:t>
+        </w:r>
+      </w:hyperlink>
+      <w:r>
+        <w:t xml:space="preserve">); those results were</w:t>
+      </w:r>
+      <w:r>
+        <w:t xml:space="preserve"> </w:t>
+      </w:r>
+      <w:r>
+        <w:t xml:space="preserve">not resubmitted to Kaggle and are reported here purely for the written</w:t>
+      </w:r>
+      <w:r>
+        <w:t xml:space="preserve"> </w:t>
+      </w:r>
+      <w:r>
+        <w:t xml:space="preserve">analysis. We did not use Kaggle notebooks or Colab for training; we used</w:t>
+      </w:r>
+      <w:r>
+        <w:t xml:space="preserve"> </w:t>
+      </w:r>
+      <w:r>
+        <w:t xml:space="preserve">GitHub and a local IDE, and uploaded submission</w:t>
+      </w:r>
+      <w:r>
+        <w:t xml:space="preserve"> </w:t>
+      </w:r>
+      <w:r>
+        <w:rPr>
+          <w:rStyle w:val="VerbatimChar"/>
+        </w:rPr>
+        <w:t xml:space="preserve">.csv</w:t>
+      </w:r>
+      <w:r>
+        <w:t xml:space="preserve"> </w:t>
+      </w:r>
+      <w:r>
+        <w:t xml:space="preserve">files to Kaggle</w:t>
+      </w:r>
+      <w:r>
+        <w:t xml:space="preserve"> </w:t>
+      </w:r>
+      <w:r>
+        <w:t xml:space="preserve">manually.</w:t>
       </w:r>
     </w:p>
     <w:bookmarkEnd w:id="96"/>

</xml_diff>